<commit_message>
docs: finalize database design and relationships
</commit_message>
<xml_diff>
--- a/docs/proposal/DC4 Mini Capstone Proposal.docx
+++ b/docs/proposal/DC4 Mini Capstone Proposal.docx
@@ -173,7 +173,7 @@
       <w:pPr>
         <w:numPr>
           <w:ilvl w:val="0"/>
-          <w:numId w:val="5"/>
+          <w:numId w:val="10"/>
         </w:numPr>
         <w:ind w:left="720" w:hanging="360"/>
         <w:jc w:val="both"/>
@@ -201,7 +201,7 @@
       <w:pPr>
         <w:numPr>
           <w:ilvl w:val="0"/>
-          <w:numId w:val="2"/>
+          <w:numId w:val="5"/>
         </w:numPr>
         <w:ind w:left="1440" w:hanging="360"/>
         <w:jc w:val="both"/>
@@ -220,7 +220,7 @@
       <w:pPr>
         <w:numPr>
           <w:ilvl w:val="0"/>
-          <w:numId w:val="2"/>
+          <w:numId w:val="5"/>
         </w:numPr>
         <w:ind w:left="1440" w:hanging="360"/>
         <w:jc w:val="both"/>
@@ -239,7 +239,7 @@
       <w:pPr>
         <w:numPr>
           <w:ilvl w:val="0"/>
-          <w:numId w:val="2"/>
+          <w:numId w:val="5"/>
         </w:numPr>
         <w:ind w:left="1440" w:hanging="360"/>
         <w:jc w:val="both"/>
@@ -258,7 +258,7 @@
       <w:pPr>
         <w:numPr>
           <w:ilvl w:val="0"/>
-          <w:numId w:val="2"/>
+          <w:numId w:val="5"/>
         </w:numPr>
         <w:ind w:left="1440" w:hanging="360"/>
         <w:jc w:val="both"/>
@@ -277,7 +277,7 @@
       <w:pPr>
         <w:numPr>
           <w:ilvl w:val="0"/>
-          <w:numId w:val="2"/>
+          <w:numId w:val="5"/>
         </w:numPr>
         <w:ind w:left="1440" w:hanging="360"/>
         <w:jc w:val="both"/>
@@ -296,7 +296,7 @@
       <w:pPr>
         <w:numPr>
           <w:ilvl w:val="0"/>
-          <w:numId w:val="2"/>
+          <w:numId w:val="5"/>
         </w:numPr>
         <w:ind w:left="1440" w:hanging="360"/>
         <w:jc w:val="both"/>
@@ -315,7 +315,7 @@
       <w:pPr>
         <w:numPr>
           <w:ilvl w:val="0"/>
-          <w:numId w:val="2"/>
+          <w:numId w:val="5"/>
         </w:numPr>
         <w:ind w:left="1440" w:hanging="360"/>
         <w:jc w:val="both"/>
@@ -334,7 +334,7 @@
       <w:pPr>
         <w:numPr>
           <w:ilvl w:val="0"/>
-          <w:numId w:val="2"/>
+          <w:numId w:val="5"/>
         </w:numPr>
         <w:ind w:left="1440" w:hanging="360"/>
         <w:jc w:val="both"/>
@@ -353,7 +353,7 @@
       <w:pPr>
         <w:numPr>
           <w:ilvl w:val="0"/>
-          <w:numId w:val="2"/>
+          <w:numId w:val="5"/>
         </w:numPr>
         <w:ind w:left="1440" w:hanging="360"/>
         <w:jc w:val="both"/>
@@ -372,7 +372,7 @@
       <w:pPr>
         <w:numPr>
           <w:ilvl w:val="0"/>
-          <w:numId w:val="5"/>
+          <w:numId w:val="10"/>
         </w:numPr>
         <w:ind w:left="720" w:hanging="360"/>
         <w:jc w:val="both"/>
@@ -400,7 +400,7 @@
       <w:pPr>
         <w:numPr>
           <w:ilvl w:val="0"/>
-          <w:numId w:val="4"/>
+          <w:numId w:val="8"/>
         </w:numPr>
         <w:ind w:left="1440" w:hanging="360"/>
         <w:jc w:val="both"/>
@@ -419,7 +419,7 @@
       <w:pPr>
         <w:numPr>
           <w:ilvl w:val="0"/>
-          <w:numId w:val="4"/>
+          <w:numId w:val="8"/>
         </w:numPr>
         <w:ind w:left="1440" w:hanging="360"/>
         <w:jc w:val="both"/>
@@ -438,7 +438,7 @@
       <w:pPr>
         <w:numPr>
           <w:ilvl w:val="0"/>
-          <w:numId w:val="4"/>
+          <w:numId w:val="8"/>
         </w:numPr>
         <w:ind w:left="1440" w:hanging="360"/>
         <w:jc w:val="both"/>
@@ -457,7 +457,7 @@
       <w:pPr>
         <w:numPr>
           <w:ilvl w:val="0"/>
-          <w:numId w:val="4"/>
+          <w:numId w:val="8"/>
         </w:numPr>
         <w:ind w:left="1440" w:hanging="360"/>
         <w:jc w:val="both"/>
@@ -476,7 +476,7 @@
       <w:pPr>
         <w:numPr>
           <w:ilvl w:val="0"/>
-          <w:numId w:val="4"/>
+          <w:numId w:val="8"/>
         </w:numPr>
         <w:ind w:left="1440" w:hanging="360"/>
         <w:jc w:val="both"/>
@@ -523,7 +523,7 @@
       <w:pPr>
         <w:numPr>
           <w:ilvl w:val="0"/>
-          <w:numId w:val="1"/>
+          <w:numId w:val="3"/>
         </w:numPr>
         <w:ind w:left="720" w:hanging="360"/>
         <w:jc w:val="both"/>
@@ -542,7 +542,7 @@
       <w:pPr>
         <w:numPr>
           <w:ilvl w:val="0"/>
-          <w:numId w:val="1"/>
+          <w:numId w:val="3"/>
         </w:numPr>
         <w:ind w:left="720" w:hanging="360"/>
         <w:jc w:val="both"/>
@@ -561,7 +561,7 @@
       <w:pPr>
         <w:numPr>
           <w:ilvl w:val="0"/>
-          <w:numId w:val="1"/>
+          <w:numId w:val="3"/>
         </w:numPr>
         <w:ind w:left="720" w:hanging="360"/>
         <w:jc w:val="both"/>
@@ -580,7 +580,7 @@
       <w:pPr>
         <w:numPr>
           <w:ilvl w:val="0"/>
-          <w:numId w:val="1"/>
+          <w:numId w:val="3"/>
         </w:numPr>
         <w:ind w:left="720" w:hanging="360"/>
         <w:jc w:val="both"/>
@@ -599,7 +599,7 @@
       <w:pPr>
         <w:numPr>
           <w:ilvl w:val="0"/>
-          <w:numId w:val="1"/>
+          <w:numId w:val="3"/>
         </w:numPr>
         <w:ind w:left="720" w:hanging="360"/>
         <w:jc w:val="both"/>
@@ -671,16 +671,1393 @@
     </w:p>
     <w:p>
       <w:pPr>
-        <w:jc w:val="both"/>
-        <w:rPr>
+        <w:pStyle w:val="Heading3"/>
+        <w:keepNext w:val="0"/>
+        <w:keepLines w:val="0"/>
+        <w:spacing w:before="280" w:lineRule="auto"/>
+        <w:jc w:val="both"/>
+        <w:rPr>
+          <w:rFonts w:ascii="Roboto Mono" w:cs="Roboto Mono" w:eastAsia="Roboto Mono" w:hAnsi="Roboto Mono"/>
           <w:b w:val="1"/>
           <w:bCs w:val="1"/>
-        </w:rPr>
-      </w:pPr>
+          <w:color w:val="000000"/>
+          <w:sz w:val="26"/>
+          <w:szCs w:val="26"/>
+        </w:rPr>
+      </w:pPr>
+      <w:bookmarkStart w:colFirst="0" w:colLast="0" w:name="_xyf1codozn1s" w:id="0"/>
+      <w:bookmarkEnd w:id="0"/>
       <w:r>
         <w:rPr>
           <w:b w:val="1"/>
           <w:bCs w:val="1"/>
+          <w:color w:val="000000"/>
+          <w:sz w:val="26"/>
+          <w:szCs w:val="26"/>
+          <w:rtl w:val="0"/>
+        </w:rPr>
+        <w:t xml:space="preserve">1. </w:t>
+      </w:r>
+      <w:r>
+        <w:rPr>
+          <w:rFonts w:ascii="Roboto Mono" w:cs="Roboto Mono" w:eastAsia="Roboto Mono" w:hAnsi="Roboto Mono"/>
+          <w:b w:val="1"/>
+          <w:bCs w:val="1"/>
+          <w:color w:val="000000"/>
+          <w:sz w:val="26"/>
+          <w:szCs w:val="26"/>
+          <w:rtl w:val="0"/>
+        </w:rPr>
+        <w:t xml:space="preserve">users</w:t>
+      </w:r>
+    </w:p>
+    <w:p>
+      <w:pPr>
+        <w:spacing w:after="240" w:before="240" w:lineRule="auto"/>
+        <w:jc w:val="both"/>
+        <w:rPr/>
+      </w:pPr>
+      <w:r>
+        <w:rPr>
+          <w:rtl w:val="0"/>
+        </w:rPr>
+        <w:t xml:space="preserve">Stores account and login information.</w:t>
+      </w:r>
+    </w:p>
+    <w:p>
+      <w:pPr>
+        <w:numPr>
+          <w:ilvl w:val="0"/>
+          <w:numId w:val="4"/>
+        </w:numPr>
+        <w:spacing w:after="0" w:afterAutospacing="0" w:before="240" w:lineRule="auto"/>
+        <w:ind w:left="720" w:hanging="360"/>
+      </w:pPr>
+      <w:r>
+        <w:rPr>
+          <w:rFonts w:ascii="Roboto Mono" w:cs="Roboto Mono" w:eastAsia="Roboto Mono" w:hAnsi="Roboto Mono"/>
+          <w:color w:val="188038"/>
+          <w:rtl w:val="0"/>
+        </w:rPr>
+        <w:t xml:space="preserve">id</w:t>
+      </w:r>
+      <w:r>
+        <w:rPr>
+          <w:rtl w:val="0"/>
+        </w:rPr>
+        <w:t xml:space="preserve"> (Primary Key)</w:t>
+      </w:r>
+    </w:p>
+    <w:p>
+      <w:pPr>
+        <w:numPr>
+          <w:ilvl w:val="0"/>
+          <w:numId w:val="4"/>
+        </w:numPr>
+        <w:spacing w:after="0" w:afterAutospacing="0" w:before="0" w:beforeAutospacing="0" w:lineRule="auto"/>
+        <w:ind w:left="720" w:hanging="360"/>
+      </w:pPr>
+      <w:r>
+        <w:rPr>
+          <w:rFonts w:ascii="Roboto Mono" w:cs="Roboto Mono" w:eastAsia="Roboto Mono" w:hAnsi="Roboto Mono"/>
+          <w:color w:val="188038"/>
+          <w:rtl w:val="0"/>
+        </w:rPr>
+        <w:t xml:space="preserve">name</w:t>
+      </w:r>
+    </w:p>
+    <w:p>
+      <w:pPr>
+        <w:numPr>
+          <w:ilvl w:val="0"/>
+          <w:numId w:val="4"/>
+        </w:numPr>
+        <w:spacing w:after="0" w:afterAutospacing="0" w:before="0" w:beforeAutospacing="0" w:lineRule="auto"/>
+        <w:ind w:left="720" w:hanging="360"/>
+      </w:pPr>
+      <w:r>
+        <w:rPr>
+          <w:rFonts w:ascii="Roboto Mono" w:cs="Roboto Mono" w:eastAsia="Roboto Mono" w:hAnsi="Roboto Mono"/>
+          <w:color w:val="188038"/>
+          <w:rtl w:val="0"/>
+        </w:rPr>
+        <w:t xml:space="preserve">email</w:t>
+      </w:r>
+      <w:r>
+        <w:rPr>
+          <w:rtl w:val="0"/>
+        </w:rPr>
+        <w:t xml:space="preserve"> (Unique)</w:t>
+      </w:r>
+    </w:p>
+    <w:p>
+      <w:pPr>
+        <w:numPr>
+          <w:ilvl w:val="0"/>
+          <w:numId w:val="4"/>
+        </w:numPr>
+        <w:spacing w:after="0" w:afterAutospacing="0" w:before="0" w:beforeAutospacing="0" w:lineRule="auto"/>
+        <w:ind w:left="720" w:hanging="360"/>
+      </w:pPr>
+      <w:r>
+        <w:rPr>
+          <w:rFonts w:ascii="Roboto Mono" w:cs="Roboto Mono" w:eastAsia="Roboto Mono" w:hAnsi="Roboto Mono"/>
+          <w:color w:val="188038"/>
+          <w:rtl w:val="0"/>
+        </w:rPr>
+        <w:t xml:space="preserve">password</w:t>
+      </w:r>
+    </w:p>
+    <w:p>
+      <w:pPr>
+        <w:numPr>
+          <w:ilvl w:val="0"/>
+          <w:numId w:val="4"/>
+        </w:numPr>
+        <w:spacing w:after="0" w:afterAutospacing="0" w:before="0" w:beforeAutospacing="0" w:lineRule="auto"/>
+        <w:ind w:left="720" w:hanging="360"/>
+      </w:pPr>
+      <w:r>
+        <w:rPr>
+          <w:rFonts w:ascii="Roboto Mono" w:cs="Roboto Mono" w:eastAsia="Roboto Mono" w:hAnsi="Roboto Mono"/>
+          <w:color w:val="188038"/>
+          <w:rtl w:val="0"/>
+        </w:rPr>
+        <w:t xml:space="preserve">role</w:t>
+      </w:r>
+      <w:r>
+        <w:rPr>
+          <w:rtl w:val="0"/>
+        </w:rPr>
+        <w:t xml:space="preserve"> (admin, staff, or customer)</w:t>
+      </w:r>
+    </w:p>
+    <w:p>
+      <w:pPr>
+        <w:numPr>
+          <w:ilvl w:val="0"/>
+          <w:numId w:val="4"/>
+        </w:numPr>
+        <w:spacing w:after="240" w:before="0" w:beforeAutospacing="0" w:lineRule="auto"/>
+        <w:ind w:left="720" w:hanging="360"/>
+      </w:pPr>
+      <w:r>
+        <w:rPr>
+          <w:rFonts w:ascii="Roboto Mono" w:cs="Roboto Mono" w:eastAsia="Roboto Mono" w:hAnsi="Roboto Mono"/>
+          <w:color w:val="188038"/>
+          <w:rtl w:val="0"/>
+        </w:rPr>
+        <w:t xml:space="preserve">created_at</w:t>
+      </w:r>
+      <w:r>
+        <w:rPr>
+          <w:rtl w:val="0"/>
+        </w:rPr>
+        <w:t xml:space="preserve">, </w:t>
+      </w:r>
+      <w:r>
+        <w:rPr>
+          <w:rFonts w:ascii="Roboto Mono" w:cs="Roboto Mono" w:eastAsia="Roboto Mono" w:hAnsi="Roboto Mono"/>
+          <w:color w:val="188038"/>
+          <w:rtl w:val="0"/>
+        </w:rPr>
+        <w:t xml:space="preserve">updated_at</w:t>
+      </w:r>
+    </w:p>
+    <w:p>
+      <w:pPr>
+        <w:pStyle w:val="Heading3"/>
+        <w:keepNext w:val="0"/>
+        <w:keepLines w:val="0"/>
+        <w:spacing w:before="280" w:lineRule="auto"/>
+        <w:jc w:val="both"/>
+        <w:rPr>
+          <w:rFonts w:ascii="Roboto Mono" w:cs="Roboto Mono" w:eastAsia="Roboto Mono" w:hAnsi="Roboto Mono"/>
+          <w:b w:val="1"/>
+          <w:bCs w:val="1"/>
+          <w:color w:val="000000"/>
+          <w:sz w:val="26"/>
+          <w:szCs w:val="26"/>
+        </w:rPr>
+      </w:pPr>
+      <w:bookmarkStart w:colFirst="0" w:colLast="0" w:name="_vg2rvtrfl476" w:id="1"/>
+      <w:bookmarkEnd w:id="1"/>
+      <w:r>
+        <w:rPr>
+          <w:b w:val="1"/>
+          <w:bCs w:val="1"/>
+          <w:color w:val="000000"/>
+          <w:sz w:val="26"/>
+          <w:szCs w:val="26"/>
+          <w:rtl w:val="0"/>
+        </w:rPr>
+        <w:t xml:space="preserve">2. </w:t>
+      </w:r>
+      <w:r>
+        <w:rPr>
+          <w:rFonts w:ascii="Roboto Mono" w:cs="Roboto Mono" w:eastAsia="Roboto Mono" w:hAnsi="Roboto Mono"/>
+          <w:b w:val="1"/>
+          <w:bCs w:val="1"/>
+          <w:color w:val="000000"/>
+          <w:sz w:val="26"/>
+          <w:szCs w:val="26"/>
+          <w:rtl w:val="0"/>
+        </w:rPr>
+        <w:t xml:space="preserve">customers</w:t>
+      </w:r>
+    </w:p>
+    <w:p>
+      <w:pPr>
+        <w:spacing w:after="240" w:before="240" w:lineRule="auto"/>
+        <w:jc w:val="both"/>
+        <w:rPr/>
+      </w:pPr>
+      <w:r>
+        <w:rPr>
+          <w:rtl w:val="0"/>
+        </w:rPr>
+        <w:t xml:space="preserve">Stores additional information about customers.</w:t>
+      </w:r>
+    </w:p>
+    <w:p>
+      <w:pPr>
+        <w:numPr>
+          <w:ilvl w:val="0"/>
+          <w:numId w:val="6"/>
+        </w:numPr>
+        <w:spacing w:after="0" w:afterAutospacing="0" w:before="240" w:lineRule="auto"/>
+        <w:ind w:left="720" w:hanging="360"/>
+      </w:pPr>
+      <w:r>
+        <w:rPr>
+          <w:rFonts w:ascii="Roboto Mono" w:cs="Roboto Mono" w:eastAsia="Roboto Mono" w:hAnsi="Roboto Mono"/>
+          <w:color w:val="188038"/>
+          <w:rtl w:val="0"/>
+        </w:rPr>
+        <w:t xml:space="preserve">id</w:t>
+      </w:r>
+      <w:r>
+        <w:rPr>
+          <w:rtl w:val="0"/>
+        </w:rPr>
+        <w:t xml:space="preserve"> (Primary Key)</w:t>
+      </w:r>
+    </w:p>
+    <w:p>
+      <w:pPr>
+        <w:numPr>
+          <w:ilvl w:val="0"/>
+          <w:numId w:val="6"/>
+        </w:numPr>
+        <w:spacing w:after="0" w:afterAutospacing="0" w:before="0" w:beforeAutospacing="0" w:lineRule="auto"/>
+        <w:ind w:left="720" w:hanging="360"/>
+      </w:pPr>
+      <w:r>
+        <w:rPr>
+          <w:rFonts w:ascii="Roboto Mono" w:cs="Roboto Mono" w:eastAsia="Roboto Mono" w:hAnsi="Roboto Mono"/>
+          <w:color w:val="188038"/>
+          <w:rtl w:val="0"/>
+        </w:rPr>
+        <w:t xml:space="preserve">user_id</w:t>
+      </w:r>
+      <w:r>
+        <w:rPr>
+          <w:rtl w:val="0"/>
+        </w:rPr>
+        <w:t xml:space="preserve"> (Foreign Key referencing </w:t>
+      </w:r>
+      <w:r>
+        <w:rPr>
+          <w:rFonts w:ascii="Roboto Mono" w:cs="Roboto Mono" w:eastAsia="Roboto Mono" w:hAnsi="Roboto Mono"/>
+          <w:color w:val="188038"/>
+          <w:rtl w:val="0"/>
+        </w:rPr>
+        <w:t xml:space="preserve">users.id</w:t>
+      </w:r>
+      <w:r>
+        <w:rPr>
+          <w:rtl w:val="0"/>
+        </w:rPr>
+        <w:t xml:space="preserve">, unique)</w:t>
+      </w:r>
+    </w:p>
+    <w:p>
+      <w:pPr>
+        <w:numPr>
+          <w:ilvl w:val="0"/>
+          <w:numId w:val="6"/>
+        </w:numPr>
+        <w:spacing w:after="0" w:afterAutospacing="0" w:before="0" w:beforeAutospacing="0" w:lineRule="auto"/>
+        <w:ind w:left="720" w:hanging="360"/>
+      </w:pPr>
+      <w:r>
+        <w:rPr>
+          <w:rFonts w:ascii="Roboto Mono" w:cs="Roboto Mono" w:eastAsia="Roboto Mono" w:hAnsi="Roboto Mono"/>
+          <w:color w:val="188038"/>
+          <w:rtl w:val="0"/>
+        </w:rPr>
+        <w:t xml:space="preserve">phone</w:t>
+      </w:r>
+    </w:p>
+    <w:p>
+      <w:pPr>
+        <w:numPr>
+          <w:ilvl w:val="0"/>
+          <w:numId w:val="6"/>
+        </w:numPr>
+        <w:spacing w:after="0" w:afterAutospacing="0" w:before="0" w:beforeAutospacing="0" w:lineRule="auto"/>
+        <w:ind w:left="720" w:hanging="360"/>
+      </w:pPr>
+      <w:r>
+        <w:rPr>
+          <w:rFonts w:ascii="Roboto Mono" w:cs="Roboto Mono" w:eastAsia="Roboto Mono" w:hAnsi="Roboto Mono"/>
+          <w:color w:val="188038"/>
+          <w:rtl w:val="0"/>
+        </w:rPr>
+        <w:t xml:space="preserve">address</w:t>
+      </w:r>
+    </w:p>
+    <w:p>
+      <w:pPr>
+        <w:numPr>
+          <w:ilvl w:val="0"/>
+          <w:numId w:val="6"/>
+        </w:numPr>
+        <w:spacing w:after="240" w:before="0" w:beforeAutospacing="0" w:lineRule="auto"/>
+        <w:ind w:left="720" w:hanging="360"/>
+      </w:pPr>
+      <w:r>
+        <w:rPr>
+          <w:rFonts w:ascii="Roboto Mono" w:cs="Roboto Mono" w:eastAsia="Roboto Mono" w:hAnsi="Roboto Mono"/>
+          <w:color w:val="188038"/>
+          <w:rtl w:val="0"/>
+        </w:rPr>
+        <w:t xml:space="preserve">created_at</w:t>
+      </w:r>
+      <w:r>
+        <w:rPr>
+          <w:rtl w:val="0"/>
+        </w:rPr>
+        <w:t xml:space="preserve">, </w:t>
+      </w:r>
+      <w:r>
+        <w:rPr>
+          <w:rFonts w:ascii="Roboto Mono" w:cs="Roboto Mono" w:eastAsia="Roboto Mono" w:hAnsi="Roboto Mono"/>
+          <w:color w:val="188038"/>
+          <w:rtl w:val="0"/>
+        </w:rPr>
+        <w:t xml:space="preserve">updated_at</w:t>
+      </w:r>
+    </w:p>
+    <w:p>
+      <w:pPr>
+        <w:pStyle w:val="Heading3"/>
+        <w:keepNext w:val="0"/>
+        <w:keepLines w:val="0"/>
+        <w:spacing w:before="280" w:lineRule="auto"/>
+        <w:jc w:val="both"/>
+        <w:rPr>
+          <w:rFonts w:ascii="Roboto Mono" w:cs="Roboto Mono" w:eastAsia="Roboto Mono" w:hAnsi="Roboto Mono"/>
+          <w:b w:val="1"/>
+          <w:bCs w:val="1"/>
+          <w:color w:val="000000"/>
+          <w:sz w:val="26"/>
+          <w:szCs w:val="26"/>
+        </w:rPr>
+      </w:pPr>
+      <w:bookmarkStart w:colFirst="0" w:colLast="0" w:name="_t0xej1vseys5" w:id="2"/>
+      <w:bookmarkEnd w:id="2"/>
+      <w:r>
+        <w:rPr>
+          <w:b w:val="1"/>
+          <w:bCs w:val="1"/>
+          <w:color w:val="000000"/>
+          <w:sz w:val="26"/>
+          <w:szCs w:val="26"/>
+          <w:rtl w:val="0"/>
+        </w:rPr>
+        <w:t xml:space="preserve">3. </w:t>
+      </w:r>
+      <w:r>
+        <w:rPr>
+          <w:rFonts w:ascii="Roboto Mono" w:cs="Roboto Mono" w:eastAsia="Roboto Mono" w:hAnsi="Roboto Mono"/>
+          <w:b w:val="1"/>
+          <w:bCs w:val="1"/>
+          <w:color w:val="000000"/>
+          <w:sz w:val="26"/>
+          <w:szCs w:val="26"/>
+          <w:rtl w:val="0"/>
+        </w:rPr>
+        <w:t xml:space="preserve">services</w:t>
+      </w:r>
+    </w:p>
+    <w:p>
+      <w:pPr>
+        <w:spacing w:after="240" w:before="240" w:lineRule="auto"/>
+        <w:jc w:val="both"/>
+        <w:rPr/>
+      </w:pPr>
+      <w:r>
+        <w:rPr>
+          <w:rtl w:val="0"/>
+        </w:rPr>
+        <w:t xml:space="preserve">Stores the services offered by J Prints.</w:t>
+      </w:r>
+    </w:p>
+    <w:p>
+      <w:pPr>
+        <w:numPr>
+          <w:ilvl w:val="0"/>
+          <w:numId w:val="11"/>
+        </w:numPr>
+        <w:spacing w:after="0" w:afterAutospacing="0" w:before="240" w:lineRule="auto"/>
+        <w:ind w:left="720" w:hanging="360"/>
+      </w:pPr>
+      <w:r>
+        <w:rPr>
+          <w:rFonts w:ascii="Roboto Mono" w:cs="Roboto Mono" w:eastAsia="Roboto Mono" w:hAnsi="Roboto Mono"/>
+          <w:color w:val="188038"/>
+          <w:rtl w:val="0"/>
+        </w:rPr>
+        <w:t xml:space="preserve">id</w:t>
+      </w:r>
+      <w:r>
+        <w:rPr>
+          <w:rtl w:val="0"/>
+        </w:rPr>
+        <w:t xml:space="preserve"> (Primary Key)</w:t>
+      </w:r>
+    </w:p>
+    <w:p>
+      <w:pPr>
+        <w:numPr>
+          <w:ilvl w:val="0"/>
+          <w:numId w:val="11"/>
+        </w:numPr>
+        <w:spacing w:after="0" w:afterAutospacing="0" w:before="0" w:beforeAutospacing="0" w:lineRule="auto"/>
+        <w:ind w:left="720" w:hanging="360"/>
+      </w:pPr>
+      <w:r>
+        <w:rPr>
+          <w:rFonts w:ascii="Roboto Mono" w:cs="Roboto Mono" w:eastAsia="Roboto Mono" w:hAnsi="Roboto Mono"/>
+          <w:color w:val="188038"/>
+          <w:rtl w:val="0"/>
+        </w:rPr>
+        <w:t xml:space="preserve">service_name</w:t>
+      </w:r>
+    </w:p>
+    <w:p>
+      <w:pPr>
+        <w:numPr>
+          <w:ilvl w:val="0"/>
+          <w:numId w:val="11"/>
+        </w:numPr>
+        <w:spacing w:after="0" w:afterAutospacing="0" w:before="0" w:beforeAutospacing="0" w:lineRule="auto"/>
+        <w:ind w:left="720" w:hanging="360"/>
+      </w:pPr>
+      <w:r>
+        <w:rPr>
+          <w:rFonts w:ascii="Roboto Mono" w:cs="Roboto Mono" w:eastAsia="Roboto Mono" w:hAnsi="Roboto Mono"/>
+          <w:color w:val="188038"/>
+          <w:rtl w:val="0"/>
+        </w:rPr>
+        <w:t xml:space="preserve">description</w:t>
+      </w:r>
+    </w:p>
+    <w:p>
+      <w:pPr>
+        <w:numPr>
+          <w:ilvl w:val="0"/>
+          <w:numId w:val="11"/>
+        </w:numPr>
+        <w:spacing w:after="0" w:afterAutospacing="0" w:before="0" w:beforeAutospacing="0" w:lineRule="auto"/>
+        <w:ind w:left="720" w:hanging="360"/>
+      </w:pPr>
+      <w:r>
+        <w:rPr>
+          <w:rFonts w:ascii="Roboto Mono" w:cs="Roboto Mono" w:eastAsia="Roboto Mono" w:hAnsi="Roboto Mono"/>
+          <w:color w:val="188038"/>
+          <w:rtl w:val="0"/>
+        </w:rPr>
+        <w:t xml:space="preserve">base_price</w:t>
+      </w:r>
+    </w:p>
+    <w:p>
+      <w:pPr>
+        <w:numPr>
+          <w:ilvl w:val="0"/>
+          <w:numId w:val="11"/>
+        </w:numPr>
+        <w:spacing w:after="0" w:afterAutospacing="0" w:before="0" w:beforeAutospacing="0" w:lineRule="auto"/>
+        <w:ind w:left="720" w:hanging="360"/>
+      </w:pPr>
+      <w:r>
+        <w:rPr>
+          <w:rFonts w:ascii="Roboto Mono" w:cs="Roboto Mono" w:eastAsia="Roboto Mono" w:hAnsi="Roboto Mono"/>
+          <w:color w:val="188038"/>
+          <w:rtl w:val="0"/>
+        </w:rPr>
+        <w:t xml:space="preserve">is_active</w:t>
+      </w:r>
+    </w:p>
+    <w:p>
+      <w:pPr>
+        <w:numPr>
+          <w:ilvl w:val="0"/>
+          <w:numId w:val="11"/>
+        </w:numPr>
+        <w:spacing w:after="240" w:before="0" w:beforeAutospacing="0" w:lineRule="auto"/>
+        <w:ind w:left="720" w:hanging="360"/>
+      </w:pPr>
+      <w:r>
+        <w:rPr>
+          <w:rFonts w:ascii="Roboto Mono" w:cs="Roboto Mono" w:eastAsia="Roboto Mono" w:hAnsi="Roboto Mono"/>
+          <w:color w:val="188038"/>
+          <w:rtl w:val="0"/>
+        </w:rPr>
+        <w:t xml:space="preserve">created_at</w:t>
+      </w:r>
+      <w:r>
+        <w:rPr>
+          <w:rtl w:val="0"/>
+        </w:rPr>
+        <w:t xml:space="preserve">, </w:t>
+      </w:r>
+      <w:r>
+        <w:rPr>
+          <w:rFonts w:ascii="Roboto Mono" w:cs="Roboto Mono" w:eastAsia="Roboto Mono" w:hAnsi="Roboto Mono"/>
+          <w:color w:val="188038"/>
+          <w:rtl w:val="0"/>
+        </w:rPr>
+        <w:t xml:space="preserve">updated_at</w:t>
+      </w:r>
+    </w:p>
+    <w:p>
+      <w:pPr>
+        <w:pStyle w:val="Heading3"/>
+        <w:keepNext w:val="0"/>
+        <w:keepLines w:val="0"/>
+        <w:spacing w:before="280" w:lineRule="auto"/>
+        <w:jc w:val="both"/>
+        <w:rPr>
+          <w:rFonts w:ascii="Roboto Mono" w:cs="Roboto Mono" w:eastAsia="Roboto Mono" w:hAnsi="Roboto Mono"/>
+          <w:b w:val="1"/>
+          <w:bCs w:val="1"/>
+          <w:color w:val="000000"/>
+          <w:sz w:val="26"/>
+          <w:szCs w:val="26"/>
+        </w:rPr>
+      </w:pPr>
+      <w:bookmarkStart w:colFirst="0" w:colLast="0" w:name="_a5xfpc1c2q9z" w:id="3"/>
+      <w:bookmarkEnd w:id="3"/>
+      <w:r>
+        <w:rPr>
+          <w:b w:val="1"/>
+          <w:bCs w:val="1"/>
+          <w:color w:val="000000"/>
+          <w:sz w:val="26"/>
+          <w:szCs w:val="26"/>
+          <w:rtl w:val="0"/>
+        </w:rPr>
+        <w:t xml:space="preserve">4. </w:t>
+      </w:r>
+      <w:r>
+        <w:rPr>
+          <w:rFonts w:ascii="Roboto Mono" w:cs="Roboto Mono" w:eastAsia="Roboto Mono" w:hAnsi="Roboto Mono"/>
+          <w:b w:val="1"/>
+          <w:bCs w:val="1"/>
+          <w:color w:val="000000"/>
+          <w:sz w:val="26"/>
+          <w:szCs w:val="26"/>
+          <w:rtl w:val="0"/>
+        </w:rPr>
+        <w:t xml:space="preserve">service_requests</w:t>
+      </w:r>
+    </w:p>
+    <w:p>
+      <w:pPr>
+        <w:spacing w:after="240" w:before="240" w:lineRule="auto"/>
+        <w:jc w:val="both"/>
+        <w:rPr/>
+      </w:pPr>
+      <w:r>
+        <w:rPr>
+          <w:rtl w:val="0"/>
+        </w:rPr>
+        <w:t xml:space="preserve">Stores customer repair requests and their current status.</w:t>
+      </w:r>
+    </w:p>
+    <w:p>
+      <w:pPr>
+        <w:numPr>
+          <w:ilvl w:val="0"/>
+          <w:numId w:val="1"/>
+        </w:numPr>
+        <w:spacing w:after="0" w:afterAutospacing="0" w:before="240" w:lineRule="auto"/>
+        <w:ind w:left="720" w:hanging="360"/>
+      </w:pPr>
+      <w:r>
+        <w:rPr>
+          <w:rFonts w:ascii="Roboto Mono" w:cs="Roboto Mono" w:eastAsia="Roboto Mono" w:hAnsi="Roboto Mono"/>
+          <w:color w:val="188038"/>
+          <w:rtl w:val="0"/>
+        </w:rPr>
+        <w:t xml:space="preserve">id</w:t>
+      </w:r>
+      <w:r>
+        <w:rPr>
+          <w:rtl w:val="0"/>
+        </w:rPr>
+        <w:t xml:space="preserve"> (Primary Key)</w:t>
+      </w:r>
+    </w:p>
+    <w:p>
+      <w:pPr>
+        <w:numPr>
+          <w:ilvl w:val="0"/>
+          <w:numId w:val="1"/>
+        </w:numPr>
+        <w:spacing w:after="0" w:afterAutospacing="0" w:before="0" w:beforeAutospacing="0" w:lineRule="auto"/>
+        <w:ind w:left="720" w:hanging="360"/>
+      </w:pPr>
+      <w:r>
+        <w:rPr>
+          <w:rFonts w:ascii="Roboto Mono" w:cs="Roboto Mono" w:eastAsia="Roboto Mono" w:hAnsi="Roboto Mono"/>
+          <w:color w:val="188038"/>
+          <w:rtl w:val="0"/>
+        </w:rPr>
+        <w:t xml:space="preserve">customer_id</w:t>
+      </w:r>
+      <w:r>
+        <w:rPr>
+          <w:rtl w:val="0"/>
+        </w:rPr>
+        <w:t xml:space="preserve"> (Foreign Key referencing </w:t>
+      </w:r>
+      <w:r>
+        <w:rPr>
+          <w:rFonts w:ascii="Roboto Mono" w:cs="Roboto Mono" w:eastAsia="Roboto Mono" w:hAnsi="Roboto Mono"/>
+          <w:color w:val="188038"/>
+          <w:rtl w:val="0"/>
+        </w:rPr>
+        <w:t xml:space="preserve">customers.id</w:t>
+      </w:r>
+      <w:r>
+        <w:rPr>
+          <w:rtl w:val="0"/>
+        </w:rPr>
+        <w:t xml:space="preserve">)</w:t>
+      </w:r>
+    </w:p>
+    <w:p>
+      <w:pPr>
+        <w:numPr>
+          <w:ilvl w:val="0"/>
+          <w:numId w:val="1"/>
+        </w:numPr>
+        <w:spacing w:after="0" w:afterAutospacing="0" w:before="0" w:beforeAutospacing="0" w:lineRule="auto"/>
+        <w:ind w:left="720" w:hanging="360"/>
+      </w:pPr>
+      <w:r>
+        <w:rPr>
+          <w:rFonts w:ascii="Roboto Mono" w:cs="Roboto Mono" w:eastAsia="Roboto Mono" w:hAnsi="Roboto Mono"/>
+          <w:color w:val="188038"/>
+          <w:rtl w:val="0"/>
+        </w:rPr>
+        <w:t xml:space="preserve">service_id</w:t>
+      </w:r>
+      <w:r>
+        <w:rPr>
+          <w:rtl w:val="0"/>
+        </w:rPr>
+        <w:t xml:space="preserve"> (Foreign Key referencing </w:t>
+      </w:r>
+      <w:r>
+        <w:rPr>
+          <w:rFonts w:ascii="Roboto Mono" w:cs="Roboto Mono" w:eastAsia="Roboto Mono" w:hAnsi="Roboto Mono"/>
+          <w:color w:val="188038"/>
+          <w:rtl w:val="0"/>
+        </w:rPr>
+        <w:t xml:space="preserve">services.id</w:t>
+      </w:r>
+      <w:r>
+        <w:rPr>
+          <w:rtl w:val="0"/>
+        </w:rPr>
+        <w:t xml:space="preserve">)</w:t>
+      </w:r>
+    </w:p>
+    <w:p>
+      <w:pPr>
+        <w:numPr>
+          <w:ilvl w:val="0"/>
+          <w:numId w:val="1"/>
+        </w:numPr>
+        <w:spacing w:after="0" w:afterAutospacing="0" w:before="0" w:beforeAutospacing="0" w:lineRule="auto"/>
+        <w:ind w:left="720" w:hanging="360"/>
+      </w:pPr>
+      <w:r>
+        <w:rPr>
+          <w:rFonts w:ascii="Roboto Mono" w:cs="Roboto Mono" w:eastAsia="Roboto Mono" w:hAnsi="Roboto Mono"/>
+          <w:color w:val="188038"/>
+          <w:rtl w:val="0"/>
+        </w:rPr>
+        <w:t xml:space="preserve">printer_brand</w:t>
+      </w:r>
+    </w:p>
+    <w:p>
+      <w:pPr>
+        <w:numPr>
+          <w:ilvl w:val="0"/>
+          <w:numId w:val="1"/>
+        </w:numPr>
+        <w:spacing w:after="0" w:afterAutospacing="0" w:before="0" w:beforeAutospacing="0" w:lineRule="auto"/>
+        <w:ind w:left="720" w:hanging="360"/>
+      </w:pPr>
+      <w:r>
+        <w:rPr>
+          <w:rFonts w:ascii="Roboto Mono" w:cs="Roboto Mono" w:eastAsia="Roboto Mono" w:hAnsi="Roboto Mono"/>
+          <w:color w:val="188038"/>
+          <w:rtl w:val="0"/>
+        </w:rPr>
+        <w:t xml:space="preserve">printer_model</w:t>
+      </w:r>
+    </w:p>
+    <w:p>
+      <w:pPr>
+        <w:numPr>
+          <w:ilvl w:val="0"/>
+          <w:numId w:val="1"/>
+        </w:numPr>
+        <w:spacing w:after="0" w:afterAutospacing="0" w:before="0" w:beforeAutospacing="0" w:lineRule="auto"/>
+        <w:ind w:left="720" w:hanging="360"/>
+      </w:pPr>
+      <w:r>
+        <w:rPr>
+          <w:rFonts w:ascii="Roboto Mono" w:cs="Roboto Mono" w:eastAsia="Roboto Mono" w:hAnsi="Roboto Mono"/>
+          <w:color w:val="188038"/>
+          <w:rtl w:val="0"/>
+        </w:rPr>
+        <w:t xml:space="preserve">issue_description</w:t>
+      </w:r>
+    </w:p>
+    <w:p>
+      <w:pPr>
+        <w:numPr>
+          <w:ilvl w:val="0"/>
+          <w:numId w:val="1"/>
+        </w:numPr>
+        <w:spacing w:after="0" w:afterAutospacing="0" w:before="0" w:beforeAutospacing="0" w:lineRule="auto"/>
+        <w:ind w:left="720" w:hanging="360"/>
+      </w:pPr>
+      <w:r>
+        <w:rPr>
+          <w:rFonts w:ascii="Roboto Mono" w:cs="Roboto Mono" w:eastAsia="Roboto Mono" w:hAnsi="Roboto Mono"/>
+          <w:color w:val="188038"/>
+          <w:rtl w:val="0"/>
+        </w:rPr>
+        <w:t xml:space="preserve">status</w:t>
+      </w:r>
+    </w:p>
+    <w:p>
+      <w:pPr>
+        <w:numPr>
+          <w:ilvl w:val="0"/>
+          <w:numId w:val="1"/>
+        </w:numPr>
+        <w:spacing w:after="0" w:afterAutospacing="0" w:before="0" w:beforeAutospacing="0" w:lineRule="auto"/>
+        <w:ind w:left="720" w:hanging="360"/>
+      </w:pPr>
+      <w:r>
+        <w:rPr>
+          <w:rFonts w:ascii="Roboto Mono" w:cs="Roboto Mono" w:eastAsia="Roboto Mono" w:hAnsi="Roboto Mono"/>
+          <w:color w:val="188038"/>
+          <w:rtl w:val="0"/>
+        </w:rPr>
+        <w:t xml:space="preserve">received_at</w:t>
+      </w:r>
+    </w:p>
+    <w:p>
+      <w:pPr>
+        <w:numPr>
+          <w:ilvl w:val="0"/>
+          <w:numId w:val="1"/>
+        </w:numPr>
+        <w:spacing w:after="240" w:before="0" w:beforeAutospacing="0" w:lineRule="auto"/>
+        <w:ind w:left="720" w:hanging="360"/>
+      </w:pPr>
+      <w:r>
+        <w:rPr>
+          <w:rFonts w:ascii="Roboto Mono" w:cs="Roboto Mono" w:eastAsia="Roboto Mono" w:hAnsi="Roboto Mono"/>
+          <w:color w:val="188038"/>
+          <w:rtl w:val="0"/>
+        </w:rPr>
+        <w:t xml:space="preserve">created_at</w:t>
+      </w:r>
+      <w:r>
+        <w:rPr>
+          <w:rtl w:val="0"/>
+        </w:rPr>
+        <w:t xml:space="preserve">, </w:t>
+      </w:r>
+      <w:r>
+        <w:rPr>
+          <w:rFonts w:ascii="Roboto Mono" w:cs="Roboto Mono" w:eastAsia="Roboto Mono" w:hAnsi="Roboto Mono"/>
+          <w:color w:val="188038"/>
+          <w:rtl w:val="0"/>
+        </w:rPr>
+        <w:t xml:space="preserve">updated_at</w:t>
+      </w:r>
+    </w:p>
+    <w:p>
+      <w:pPr>
+        <w:pStyle w:val="Heading3"/>
+        <w:keepNext w:val="0"/>
+        <w:keepLines w:val="0"/>
+        <w:spacing w:before="280" w:lineRule="auto"/>
+        <w:jc w:val="both"/>
+        <w:rPr>
+          <w:rFonts w:ascii="Roboto Mono" w:cs="Roboto Mono" w:eastAsia="Roboto Mono" w:hAnsi="Roboto Mono"/>
+          <w:b w:val="1"/>
+          <w:bCs w:val="1"/>
+          <w:color w:val="000000"/>
+          <w:sz w:val="26"/>
+          <w:szCs w:val="26"/>
+        </w:rPr>
+      </w:pPr>
+      <w:bookmarkStart w:colFirst="0" w:colLast="0" w:name="_ua76je36n94m" w:id="4"/>
+      <w:bookmarkEnd w:id="4"/>
+      <w:r>
+        <w:rPr>
+          <w:b w:val="1"/>
+          <w:bCs w:val="1"/>
+          <w:color w:val="000000"/>
+          <w:sz w:val="26"/>
+          <w:szCs w:val="26"/>
+          <w:rtl w:val="0"/>
+        </w:rPr>
+        <w:t xml:space="preserve">5. </w:t>
+      </w:r>
+      <w:r>
+        <w:rPr>
+          <w:rFonts w:ascii="Roboto Mono" w:cs="Roboto Mono" w:eastAsia="Roboto Mono" w:hAnsi="Roboto Mono"/>
+          <w:b w:val="1"/>
+          <w:bCs w:val="1"/>
+          <w:color w:val="000000"/>
+          <w:sz w:val="26"/>
+          <w:szCs w:val="26"/>
+          <w:rtl w:val="0"/>
+        </w:rPr>
+        <w:t xml:space="preserve">service_records</w:t>
+      </w:r>
+    </w:p>
+    <w:p>
+      <w:pPr>
+        <w:spacing w:after="240" w:before="240" w:lineRule="auto"/>
+        <w:jc w:val="both"/>
+        <w:rPr/>
+      </w:pPr>
+      <w:r>
+        <w:rPr>
+          <w:rtl w:val="0"/>
+        </w:rPr>
+        <w:t xml:space="preserve">Stores diagnosis and repair updates for each request.</w:t>
+      </w:r>
+    </w:p>
+    <w:p>
+      <w:pPr>
+        <w:numPr>
+          <w:ilvl w:val="0"/>
+          <w:numId w:val="2"/>
+        </w:numPr>
+        <w:spacing w:after="0" w:afterAutospacing="0" w:before="240" w:lineRule="auto"/>
+        <w:ind w:left="720" w:hanging="360"/>
+      </w:pPr>
+      <w:r>
+        <w:rPr>
+          <w:rFonts w:ascii="Roboto Mono" w:cs="Roboto Mono" w:eastAsia="Roboto Mono" w:hAnsi="Roboto Mono"/>
+          <w:color w:val="188038"/>
+          <w:rtl w:val="0"/>
+        </w:rPr>
+        <w:t xml:space="preserve">id</w:t>
+      </w:r>
+      <w:r>
+        <w:rPr>
+          <w:rtl w:val="0"/>
+        </w:rPr>
+        <w:t xml:space="preserve"> (Primary Key)</w:t>
+      </w:r>
+    </w:p>
+    <w:p>
+      <w:pPr>
+        <w:numPr>
+          <w:ilvl w:val="0"/>
+          <w:numId w:val="2"/>
+        </w:numPr>
+        <w:spacing w:after="0" w:afterAutospacing="0" w:before="0" w:beforeAutospacing="0" w:lineRule="auto"/>
+        <w:ind w:left="720" w:hanging="360"/>
+      </w:pPr>
+      <w:r>
+        <w:rPr>
+          <w:rFonts w:ascii="Roboto Mono" w:cs="Roboto Mono" w:eastAsia="Roboto Mono" w:hAnsi="Roboto Mono"/>
+          <w:color w:val="188038"/>
+          <w:rtl w:val="0"/>
+        </w:rPr>
+        <w:t xml:space="preserve">service_request_id</w:t>
+      </w:r>
+      <w:r>
+        <w:rPr>
+          <w:rtl w:val="0"/>
+        </w:rPr>
+        <w:t xml:space="preserve"> (Foreign Key referencing </w:t>
+      </w:r>
+      <w:r>
+        <w:rPr>
+          <w:rFonts w:ascii="Roboto Mono" w:cs="Roboto Mono" w:eastAsia="Roboto Mono" w:hAnsi="Roboto Mono"/>
+          <w:color w:val="188038"/>
+          <w:rtl w:val="0"/>
+        </w:rPr>
+        <w:t xml:space="preserve">service_requests.id</w:t>
+      </w:r>
+      <w:r>
+        <w:rPr>
+          <w:rtl w:val="0"/>
+        </w:rPr>
+        <w:t xml:space="preserve">)</w:t>
+      </w:r>
+    </w:p>
+    <w:p>
+      <w:pPr>
+        <w:numPr>
+          <w:ilvl w:val="0"/>
+          <w:numId w:val="2"/>
+        </w:numPr>
+        <w:spacing w:after="0" w:afterAutospacing="0" w:before="0" w:beforeAutospacing="0" w:lineRule="auto"/>
+        <w:ind w:left="720" w:hanging="360"/>
+      </w:pPr>
+      <w:r>
+        <w:rPr>
+          <w:rFonts w:ascii="Roboto Mono" w:cs="Roboto Mono" w:eastAsia="Roboto Mono" w:hAnsi="Roboto Mono"/>
+          <w:color w:val="188038"/>
+          <w:rtl w:val="0"/>
+        </w:rPr>
+        <w:t xml:space="preserve">staff_user_id</w:t>
+      </w:r>
+      <w:r>
+        <w:rPr>
+          <w:rtl w:val="0"/>
+        </w:rPr>
+        <w:t xml:space="preserve"> (Foreign Key referencing </w:t>
+      </w:r>
+      <w:r>
+        <w:rPr>
+          <w:rFonts w:ascii="Roboto Mono" w:cs="Roboto Mono" w:eastAsia="Roboto Mono" w:hAnsi="Roboto Mono"/>
+          <w:color w:val="188038"/>
+          <w:rtl w:val="0"/>
+        </w:rPr>
+        <w:t xml:space="preserve">users.id</w:t>
+      </w:r>
+      <w:r>
+        <w:rPr>
+          <w:rtl w:val="0"/>
+        </w:rPr>
+        <w:t xml:space="preserve">)</w:t>
+      </w:r>
+    </w:p>
+    <w:p>
+      <w:pPr>
+        <w:numPr>
+          <w:ilvl w:val="0"/>
+          <w:numId w:val="2"/>
+        </w:numPr>
+        <w:spacing w:after="0" w:afterAutospacing="0" w:before="0" w:beforeAutospacing="0" w:lineRule="auto"/>
+        <w:ind w:left="720" w:hanging="360"/>
+      </w:pPr>
+      <w:r>
+        <w:rPr>
+          <w:rFonts w:ascii="Roboto Mono" w:cs="Roboto Mono" w:eastAsia="Roboto Mono" w:hAnsi="Roboto Mono"/>
+          <w:color w:val="188038"/>
+          <w:rtl w:val="0"/>
+        </w:rPr>
+        <w:t xml:space="preserve">diagnosis</w:t>
+      </w:r>
+    </w:p>
+    <w:p>
+      <w:pPr>
+        <w:numPr>
+          <w:ilvl w:val="0"/>
+          <w:numId w:val="2"/>
+        </w:numPr>
+        <w:spacing w:after="0" w:afterAutospacing="0" w:before="0" w:beforeAutospacing="0" w:lineRule="auto"/>
+        <w:ind w:left="720" w:hanging="360"/>
+      </w:pPr>
+      <w:r>
+        <w:rPr>
+          <w:rFonts w:ascii="Roboto Mono" w:cs="Roboto Mono" w:eastAsia="Roboto Mono" w:hAnsi="Roboto Mono"/>
+          <w:color w:val="188038"/>
+          <w:rtl w:val="0"/>
+        </w:rPr>
+        <w:t xml:space="preserve">work_performed</w:t>
+      </w:r>
+    </w:p>
+    <w:p>
+      <w:pPr>
+        <w:numPr>
+          <w:ilvl w:val="0"/>
+          <w:numId w:val="2"/>
+        </w:numPr>
+        <w:spacing w:after="0" w:afterAutospacing="0" w:before="0" w:beforeAutospacing="0" w:lineRule="auto"/>
+        <w:ind w:left="720" w:hanging="360"/>
+      </w:pPr>
+      <w:r>
+        <w:rPr>
+          <w:rFonts w:ascii="Roboto Mono" w:cs="Roboto Mono" w:eastAsia="Roboto Mono" w:hAnsi="Roboto Mono"/>
+          <w:color w:val="188038"/>
+          <w:rtl w:val="0"/>
+        </w:rPr>
+        <w:t xml:space="preserve">parts_used</w:t>
+      </w:r>
+    </w:p>
+    <w:p>
+      <w:pPr>
+        <w:numPr>
+          <w:ilvl w:val="0"/>
+          <w:numId w:val="2"/>
+        </w:numPr>
+        <w:spacing w:after="0" w:afterAutospacing="0" w:before="0" w:beforeAutospacing="0" w:lineRule="auto"/>
+        <w:ind w:left="720" w:hanging="360"/>
+      </w:pPr>
+      <w:r>
+        <w:rPr>
+          <w:rFonts w:ascii="Roboto Mono" w:cs="Roboto Mono" w:eastAsia="Roboto Mono" w:hAnsi="Roboto Mono"/>
+          <w:color w:val="188038"/>
+          <w:rtl w:val="0"/>
+        </w:rPr>
+        <w:t xml:space="preserve">labor_cost</w:t>
+      </w:r>
+    </w:p>
+    <w:p>
+      <w:pPr>
+        <w:numPr>
+          <w:ilvl w:val="0"/>
+          <w:numId w:val="2"/>
+        </w:numPr>
+        <w:spacing w:after="0" w:afterAutospacing="0" w:before="0" w:beforeAutospacing="0" w:lineRule="auto"/>
+        <w:ind w:left="720" w:hanging="360"/>
+      </w:pPr>
+      <w:r>
+        <w:rPr>
+          <w:rFonts w:ascii="Roboto Mono" w:cs="Roboto Mono" w:eastAsia="Roboto Mono" w:hAnsi="Roboto Mono"/>
+          <w:color w:val="188038"/>
+          <w:rtl w:val="0"/>
+        </w:rPr>
+        <w:t xml:space="preserve">notes</w:t>
+      </w:r>
+    </w:p>
+    <w:p>
+      <w:pPr>
+        <w:numPr>
+          <w:ilvl w:val="0"/>
+          <w:numId w:val="2"/>
+        </w:numPr>
+        <w:spacing w:after="0" w:afterAutospacing="0" w:before="0" w:beforeAutospacing="0" w:lineRule="auto"/>
+        <w:ind w:left="720" w:hanging="360"/>
+      </w:pPr>
+      <w:r>
+        <w:rPr>
+          <w:rFonts w:ascii="Roboto Mono" w:cs="Roboto Mono" w:eastAsia="Roboto Mono" w:hAnsi="Roboto Mono"/>
+          <w:color w:val="188038"/>
+          <w:rtl w:val="0"/>
+        </w:rPr>
+        <w:t xml:space="preserve">recorded_at</w:t>
+      </w:r>
+    </w:p>
+    <w:p>
+      <w:pPr>
+        <w:numPr>
+          <w:ilvl w:val="0"/>
+          <w:numId w:val="2"/>
+        </w:numPr>
+        <w:spacing w:after="240" w:before="0" w:beforeAutospacing="0" w:lineRule="auto"/>
+        <w:ind w:left="720" w:hanging="360"/>
+      </w:pPr>
+      <w:r>
+        <w:rPr>
+          <w:rFonts w:ascii="Roboto Mono" w:cs="Roboto Mono" w:eastAsia="Roboto Mono" w:hAnsi="Roboto Mono"/>
+          <w:color w:val="188038"/>
+          <w:rtl w:val="0"/>
+        </w:rPr>
+        <w:t xml:space="preserve">created_at</w:t>
+      </w:r>
+      <w:r>
+        <w:rPr>
+          <w:rtl w:val="0"/>
+        </w:rPr>
+        <w:t xml:space="preserve">, </w:t>
+      </w:r>
+      <w:r>
+        <w:rPr>
+          <w:rFonts w:ascii="Roboto Mono" w:cs="Roboto Mono" w:eastAsia="Roboto Mono" w:hAnsi="Roboto Mono"/>
+          <w:color w:val="188038"/>
+          <w:rtl w:val="0"/>
+        </w:rPr>
+        <w:t xml:space="preserve">updated_at</w:t>
+      </w:r>
+    </w:p>
+    <w:p>
+      <w:pPr>
+        <w:jc w:val="both"/>
+        <w:rPr/>
+      </w:pPr>
+      <w:r>
+        <w:rPr>
+          <w:rtl w:val="0"/>
+        </w:rPr>
+      </w:r>
+    </w:p>
+    <w:p>
+      <w:pPr>
+        <w:jc w:val="both"/>
+        <w:rPr/>
+      </w:pPr>
+      <w:r>
+        <w:rPr>
+          <w:rtl w:val="0"/>
+        </w:rPr>
+      </w:r>
+    </w:p>
+    <w:p>
+      <w:pPr>
+        <w:jc w:val="both"/>
+        <w:rPr/>
+      </w:pPr>
+      <w:r>
+        <w:rPr>
+          <w:rtl w:val="0"/>
+        </w:rPr>
+      </w:r>
+    </w:p>
+    <w:p>
+      <w:pPr>
+        <w:jc w:val="both"/>
+        <w:rPr/>
+      </w:pPr>
+      <w:r>
+        <w:rPr>
+          <w:rtl w:val="0"/>
+        </w:rPr>
+      </w:r>
+    </w:p>
+    <w:p>
+      <w:pPr>
+        <w:jc w:val="both"/>
+        <w:rPr/>
+      </w:pPr>
+      <w:r>
+        <w:rPr>
+          <w:rtl w:val="0"/>
+        </w:rPr>
+      </w:r>
+    </w:p>
+    <w:p>
+      <w:pPr>
+        <w:jc w:val="both"/>
+        <w:rPr/>
+      </w:pPr>
+      <w:r>
+        <w:rPr>
+          <w:rtl w:val="0"/>
+        </w:rPr>
+      </w:r>
+    </w:p>
+    <w:p>
+      <w:pPr>
+        <w:jc w:val="both"/>
+        <w:rPr/>
+      </w:pPr>
+      <w:r>
+        <w:rPr>
+          <w:rtl w:val="0"/>
+        </w:rPr>
+      </w:r>
+    </w:p>
+    <w:p>
+      <w:pPr>
+        <w:jc w:val="both"/>
+        <w:rPr/>
+      </w:pPr>
+      <w:r>
+        <w:rPr>
+          <w:rtl w:val="0"/>
+        </w:rPr>
+      </w:r>
+    </w:p>
+    <w:p>
+      <w:pPr>
+        <w:jc w:val="both"/>
+        <w:rPr/>
+      </w:pPr>
+      <w:r>
+        <w:rPr>
+          <w:rtl w:val="0"/>
+        </w:rPr>
+      </w:r>
+    </w:p>
+    <w:p>
+      <w:pPr>
+        <w:jc w:val="both"/>
+        <w:rPr/>
+      </w:pPr>
+      <w:r>
+        <w:rPr>
+          <w:rtl w:val="0"/>
+        </w:rPr>
+      </w:r>
+    </w:p>
+    <w:p>
+      <w:pPr>
+        <w:jc w:val="both"/>
+        <w:rPr/>
+      </w:pPr>
+      <w:r>
+        <w:rPr>
+          <w:rtl w:val="0"/>
+        </w:rPr>
+      </w:r>
+    </w:p>
+    <w:p>
+      <w:pPr>
+        <w:jc w:val="both"/>
+        <w:rPr/>
+      </w:pPr>
+      <w:r>
+        <w:rPr>
+          <w:rtl w:val="0"/>
+        </w:rPr>
+      </w:r>
+    </w:p>
+    <w:p>
+      <w:pPr>
+        <w:jc w:val="both"/>
+        <w:rPr/>
+      </w:pPr>
+      <w:r>
+        <w:rPr>
+          <w:rtl w:val="0"/>
+        </w:rPr>
+      </w:r>
+    </w:p>
+    <w:p>
+      <w:pPr>
+        <w:jc w:val="both"/>
+        <w:rPr/>
+      </w:pPr>
+      <w:r>
+        <w:rPr>
+          <w:rtl w:val="0"/>
+        </w:rPr>
+      </w:r>
+    </w:p>
+    <w:p>
+      <w:pPr>
+        <w:jc w:val="both"/>
+        <w:rPr/>
+      </w:pPr>
+      <w:r>
+        <w:rPr>
+          <w:rtl w:val="0"/>
+        </w:rPr>
+      </w:r>
+    </w:p>
+    <w:p>
+      <w:pPr>
+        <w:jc w:val="both"/>
+        <w:rPr/>
+      </w:pPr>
+      <w:r>
+        <w:rPr>
+          <w:rtl w:val="0"/>
+        </w:rPr>
+      </w:r>
+    </w:p>
+    <w:p>
+      <w:pPr>
+        <w:jc w:val="both"/>
+        <w:rPr/>
+      </w:pPr>
+      <w:r>
+        <w:rPr>
+          <w:rtl w:val="0"/>
+        </w:rPr>
+      </w:r>
+    </w:p>
+    <w:p>
+      <w:pPr>
+        <w:jc w:val="both"/>
+        <w:rPr/>
+      </w:pPr>
+      <w:r>
+        <w:rPr>
+          <w:rtl w:val="0"/>
+        </w:rPr>
+      </w:r>
+    </w:p>
+    <w:p>
+      <w:pPr>
+        <w:jc w:val="both"/>
+        <w:rPr/>
+      </w:pPr>
+      <w:r>
+        <w:rPr>
+          <w:rtl w:val="0"/>
+        </w:rPr>
+      </w:r>
+    </w:p>
+    <w:p>
+      <w:pPr>
+        <w:jc w:val="both"/>
+        <w:rPr/>
+      </w:pPr>
+      <w:r>
+        <w:rPr>
+          <w:rtl w:val="0"/>
+        </w:rPr>
+      </w:r>
+    </w:p>
+    <w:p>
+      <w:pPr>
+        <w:jc w:val="both"/>
+        <w:rPr/>
+      </w:pPr>
+      <w:r>
+        <w:rPr>
+          <w:rtl w:val="0"/>
+        </w:rPr>
+      </w:r>
+    </w:p>
+    <w:p>
+      <w:pPr>
+        <w:jc w:val="both"/>
+        <w:rPr/>
+      </w:pPr>
+      <w:r>
+        <w:rPr>
+          <w:rtl w:val="0"/>
+        </w:rPr>
+      </w:r>
+    </w:p>
+    <w:p>
+      <w:pPr>
+        <w:jc w:val="both"/>
+        <w:rPr>
+          <w:b w:val="1"/>
+          <w:bCs w:val="1"/>
+        </w:rPr>
+      </w:pPr>
+      <w:r>
+        <w:rPr>
+          <w:b w:val="1"/>
+          <w:bCs w:val="1"/>
           <w:rtl w:val="0"/>
         </w:rPr>
         <w:t xml:space="preserve">Basic Relationships</w:t>
@@ -689,7 +2066,12 @@
     <w:p>
       <w:pPr>
         <w:jc w:val="both"/>
-        <w:rPr/>
+        <w:rPr>
+          <w:b w:val="1"/>
+          <w:bCs w:val="1"/>
+          <w:sz w:val="34"/>
+          <w:szCs w:val="34"/>
+        </w:rPr>
       </w:pPr>
       <w:r>
         <w:rPr/>
@@ -707,7 +2089,7 @@
                   </pic:nvPicPr>
                   <pic:blipFill>
                     <a:blip r:embed="rId6"/>
-                    <a:srcRect b="0" l="0" r="0" t="0"/>
+                    <a:srcRect b="203" l="0" r="0" t="203"/>
                     <a:stretch>
                       <a:fillRect/>
                     </a:stretch>
@@ -734,11 +2116,49 @@
     </w:p>
     <w:p>
       <w:pPr>
-        <w:jc w:val="both"/>
+        <w:spacing w:after="240" w:before="240" w:lineRule="auto"/>
+        <w:jc w:val="both"/>
+        <w:rPr/>
+      </w:pPr>
+      <w:r>
+        <w:rPr>
+          <w:rtl w:val="0"/>
+        </w:rPr>
+        <w:t xml:space="preserve">The J Prints Service Management System uses five main tables: Users, Customers, Services, Service Requests, and Service Records. These tables are connected to organize customer information, available services, repair requests, and the progress of each repair.</w:t>
+      </w:r>
+    </w:p>
+    <w:p>
+      <w:pPr>
+        <w:numPr>
+          <w:ilvl w:val="0"/>
+          <w:numId w:val="9"/>
+        </w:numPr>
+        <w:spacing w:after="0" w:afterAutospacing="0" w:before="240" w:lineRule="auto"/>
+        <w:ind w:left="720" w:hanging="360"/>
+      </w:pPr>
+      <w:r>
         <w:rPr>
           <w:b w:val="1"/>
           <w:bCs w:val="1"/>
-        </w:rPr>
+          <w:rtl w:val="0"/>
+        </w:rPr>
+        <w:t xml:space="preserve">Users and Customers:</w:t>
+      </w:r>
+      <w:r>
+        <w:rPr>
+          <w:rtl w:val="0"/>
+        </w:rPr>
+        <w:t xml:space="preserve"> One user account can have one customer profile. The Users table stores login information and the user's role, while the Customers table stores additional customer information. Staff and administrator accounts do not need customer profiles.</w:t>
+      </w:r>
+    </w:p>
+    <w:p>
+      <w:pPr>
+        <w:numPr>
+          <w:ilvl w:val="0"/>
+          <w:numId w:val="9"/>
+        </w:numPr>
+        <w:spacing w:after="0" w:afterAutospacing="0" w:before="0" w:beforeAutospacing="0" w:lineRule="auto"/>
+        <w:ind w:left="720" w:hanging="360"/>
       </w:pPr>
       <w:r>
         <w:rPr>
@@ -746,6 +2166,310 @@
           <w:bCs w:val="1"/>
           <w:rtl w:val="0"/>
         </w:rPr>
+        <w:t xml:space="preserve">Customers and Service Requests:</w:t>
+      </w:r>
+      <w:r>
+        <w:rPr>
+          <w:rtl w:val="0"/>
+        </w:rPr>
+        <w:t xml:space="preserve"> One customer can submit multiple service requests, but each service request belongs to one customer.</w:t>
+      </w:r>
+    </w:p>
+    <w:p>
+      <w:pPr>
+        <w:numPr>
+          <w:ilvl w:val="0"/>
+          <w:numId w:val="9"/>
+        </w:numPr>
+        <w:spacing w:after="0" w:afterAutospacing="0" w:before="0" w:beforeAutospacing="0" w:lineRule="auto"/>
+        <w:ind w:left="720" w:hanging="360"/>
+      </w:pPr>
+      <w:r>
+        <w:rPr>
+          <w:b w:val="1"/>
+          <w:bCs w:val="1"/>
+          <w:rtl w:val="0"/>
+        </w:rPr>
+        <w:t xml:space="preserve">Services and Service Requests:</w:t>
+      </w:r>
+      <w:r>
+        <w:rPr>
+          <w:rtl w:val="0"/>
+        </w:rPr>
+        <w:t xml:space="preserve"> One service can be selected for multiple service requests, but each service request is associated with one service.</w:t>
+      </w:r>
+    </w:p>
+    <w:p>
+      <w:pPr>
+        <w:numPr>
+          <w:ilvl w:val="0"/>
+          <w:numId w:val="9"/>
+        </w:numPr>
+        <w:spacing w:after="0" w:afterAutospacing="0" w:before="0" w:beforeAutospacing="0" w:lineRule="auto"/>
+        <w:ind w:left="720" w:hanging="360"/>
+      </w:pPr>
+      <w:r>
+        <w:rPr>
+          <w:b w:val="1"/>
+          <w:bCs w:val="1"/>
+          <w:rtl w:val="0"/>
+        </w:rPr>
+        <w:t xml:space="preserve">Service Requests and Service Records:</w:t>
+      </w:r>
+      <w:r>
+        <w:rPr>
+          <w:rtl w:val="0"/>
+        </w:rPr>
+        <w:t xml:space="preserve"> One service request can have multiple service records to document diagnosis, repair progress, parts used, and other service updates. Each service record belongs to one service request.</w:t>
+      </w:r>
+    </w:p>
+    <w:p>
+      <w:pPr>
+        <w:numPr>
+          <w:ilvl w:val="0"/>
+          <w:numId w:val="9"/>
+        </w:numPr>
+        <w:spacing w:after="240" w:before="0" w:beforeAutospacing="0" w:lineRule="auto"/>
+        <w:ind w:left="720" w:hanging="360"/>
+      </w:pPr>
+      <w:r>
+        <w:rPr>
+          <w:b w:val="1"/>
+          <w:bCs w:val="1"/>
+          <w:rtl w:val="0"/>
+        </w:rPr>
+        <w:t xml:space="preserve">Users and Service Records:</w:t>
+      </w:r>
+      <w:r>
+        <w:rPr>
+          <w:rtl w:val="0"/>
+        </w:rPr>
+        <w:t xml:space="preserve"> One staff or administrator account can create multiple service records. Each record identifies the staff member who documented the service update.</w:t>
+      </w:r>
+    </w:p>
+    <w:p>
+      <w:pPr>
+        <w:spacing w:after="240" w:before="240" w:lineRule="auto"/>
+        <w:rPr/>
+      </w:pPr>
+      <w:r>
+        <w:rPr>
+          <w:rtl w:val="0"/>
+        </w:rPr>
+      </w:r>
+    </w:p>
+    <w:p>
+      <w:pPr>
+        <w:spacing w:after="240" w:before="240" w:lineRule="auto"/>
+        <w:rPr/>
+      </w:pPr>
+      <w:r>
+        <w:rPr>
+          <w:rtl w:val="0"/>
+        </w:rPr>
+      </w:r>
+    </w:p>
+    <w:p>
+      <w:pPr>
+        <w:pStyle w:val="Heading3"/>
+        <w:keepNext w:val="0"/>
+        <w:keepLines w:val="0"/>
+        <w:spacing w:before="280" w:lineRule="auto"/>
+        <w:jc w:val="both"/>
+        <w:rPr>
+          <w:b w:val="1"/>
+          <w:bCs w:val="1"/>
+          <w:color w:val="000000"/>
+          <w:sz w:val="22"/>
+          <w:szCs w:val="22"/>
+        </w:rPr>
+      </w:pPr>
+      <w:bookmarkStart w:colFirst="0" w:colLast="0" w:name="_h7w2wgp9f0bt" w:id="5"/>
+      <w:bookmarkEnd w:id="5"/>
+      <w:r>
+        <w:rPr>
+          <w:b w:val="1"/>
+          <w:bCs w:val="1"/>
+          <w:color w:val="000000"/>
+          <w:sz w:val="22"/>
+          <w:szCs w:val="22"/>
+          <w:rtl w:val="0"/>
+        </w:rPr>
+        <w:t xml:space="preserve">Service Request Statuses</w:t>
+      </w:r>
+    </w:p>
+    <w:p>
+      <w:pPr>
+        <w:spacing w:after="240" w:before="240" w:lineRule="auto"/>
+        <w:jc w:val="both"/>
+        <w:rPr/>
+      </w:pPr>
+      <w:r>
+        <w:rPr>
+          <w:rtl w:val="0"/>
+        </w:rPr>
+        <w:t xml:space="preserve">The system will use the following statuses to track each printer repair request:</w:t>
+      </w:r>
+    </w:p>
+    <w:p>
+      <w:pPr>
+        <w:numPr>
+          <w:ilvl w:val="0"/>
+          <w:numId w:val="12"/>
+        </w:numPr>
+        <w:spacing w:after="0" w:afterAutospacing="0" w:before="240" w:lineRule="auto"/>
+        <w:ind w:left="720" w:hanging="360"/>
+      </w:pPr>
+      <w:r>
+        <w:rPr>
+          <w:b w:val="1"/>
+          <w:bCs w:val="1"/>
+          <w:rtl w:val="0"/>
+        </w:rPr>
+        <w:t xml:space="preserve">Received:</w:t>
+      </w:r>
+      <w:r>
+        <w:rPr>
+          <w:rtl w:val="0"/>
+        </w:rPr>
+        <w:t xml:space="preserve"> The printer has been accepted by J Prints, and the request has been recorded.</w:t>
+      </w:r>
+    </w:p>
+    <w:p>
+      <w:pPr>
+        <w:numPr>
+          <w:ilvl w:val="0"/>
+          <w:numId w:val="12"/>
+        </w:numPr>
+        <w:spacing w:after="0" w:afterAutospacing="0" w:before="0" w:beforeAutospacing="0" w:lineRule="auto"/>
+        <w:ind w:left="720" w:hanging="360"/>
+      </w:pPr>
+      <w:r>
+        <w:rPr>
+          <w:b w:val="1"/>
+          <w:bCs w:val="1"/>
+          <w:rtl w:val="0"/>
+        </w:rPr>
+        <w:t xml:space="preserve">Diagnosing:</w:t>
+      </w:r>
+      <w:r>
+        <w:rPr>
+          <w:rtl w:val="0"/>
+        </w:rPr>
+        <w:t xml:space="preserve"> The printer is being inspected to identify the problem.</w:t>
+      </w:r>
+    </w:p>
+    <w:p>
+      <w:pPr>
+        <w:numPr>
+          <w:ilvl w:val="0"/>
+          <w:numId w:val="12"/>
+        </w:numPr>
+        <w:spacing w:after="0" w:afterAutospacing="0" w:before="0" w:beforeAutospacing="0" w:lineRule="auto"/>
+        <w:ind w:left="720" w:hanging="360"/>
+      </w:pPr>
+      <w:r>
+        <w:rPr>
+          <w:b w:val="1"/>
+          <w:bCs w:val="1"/>
+          <w:rtl w:val="0"/>
+        </w:rPr>
+        <w:t xml:space="preserve">Repairing:</w:t>
+      </w:r>
+      <w:r>
+        <w:rPr>
+          <w:rtl w:val="0"/>
+        </w:rPr>
+        <w:t xml:space="preserve"> The repair work is in progress.</w:t>
+      </w:r>
+    </w:p>
+    <w:p>
+      <w:pPr>
+        <w:numPr>
+          <w:ilvl w:val="0"/>
+          <w:numId w:val="12"/>
+        </w:numPr>
+        <w:spacing w:after="0" w:afterAutospacing="0" w:before="0" w:beforeAutospacing="0" w:lineRule="auto"/>
+        <w:ind w:left="720" w:hanging="360"/>
+      </w:pPr>
+      <w:r>
+        <w:rPr>
+          <w:b w:val="1"/>
+          <w:bCs w:val="1"/>
+          <w:rtl w:val="0"/>
+        </w:rPr>
+        <w:t xml:space="preserve">Ready:</w:t>
+      </w:r>
+      <w:r>
+        <w:rPr>
+          <w:rtl w:val="0"/>
+        </w:rPr>
+        <w:t xml:space="preserve"> The repair is finished, and the printer is ready for collection.</w:t>
+      </w:r>
+    </w:p>
+    <w:p>
+      <w:pPr>
+        <w:numPr>
+          <w:ilvl w:val="0"/>
+          <w:numId w:val="12"/>
+        </w:numPr>
+        <w:spacing w:after="240" w:before="0" w:beforeAutospacing="0" w:lineRule="auto"/>
+        <w:ind w:left="720" w:hanging="360"/>
+      </w:pPr>
+      <w:r>
+        <w:rPr>
+          <w:b w:val="1"/>
+          <w:bCs w:val="1"/>
+          <w:rtl w:val="0"/>
+        </w:rPr>
+        <w:t xml:space="preserve">Released:</w:t>
+      </w:r>
+      <w:r>
+        <w:rPr>
+          <w:rtl w:val="0"/>
+        </w:rPr>
+        <w:t xml:space="preserve"> The printer has been returned to the customer, completing the request.</w:t>
+      </w:r>
+    </w:p>
+    <w:p>
+      <w:pPr>
+        <w:spacing w:after="240" w:before="240" w:lineRule="auto"/>
+        <w:jc w:val="both"/>
+        <w:rPr/>
+      </w:pPr>
+      <w:r>
+        <w:rPr>
+          <w:rFonts w:ascii="Arial Unicode MS" w:cs="Arial Unicode MS" w:eastAsia="Arial Unicode MS" w:hAnsi="Arial Unicode MS"/>
+          <w:rtl w:val="0"/>
+        </w:rPr>
+        <w:t xml:space="preserve">The normal workflow is Received → Diagnosing → Repairing → Ready → Released. Authorized staff or administrators will update the request status as the repair progresses, while customers can view the status of their own requests.</w:t>
+      </w:r>
+    </w:p>
+    <w:p>
+      <w:pPr>
+        <w:jc w:val="both"/>
+        <w:rPr/>
+      </w:pPr>
+      <w:r>
+        <w:rPr>
+          <w:rtl w:val="0"/>
+        </w:rPr>
+      </w:r>
+    </w:p>
+    <w:p>
+      <w:pPr>
+        <w:jc w:val="both"/>
+        <w:rPr>
+          <w:b w:val="1"/>
+          <w:bCs w:val="1"/>
+        </w:rPr>
+      </w:pPr>
+      <w:r>
+        <w:rPr>
+          <w:b w:val="1"/>
+          <w:bCs w:val="1"/>
+          <w:rtl w:val="0"/>
+        </w:rPr>
         <w:t xml:space="preserve">Planned Features</w:t>
       </w:r>
     </w:p>
@@ -753,7 +2477,7 @@
       <w:pPr>
         <w:numPr>
           <w:ilvl w:val="0"/>
-          <w:numId w:val="3"/>
+          <w:numId w:val="7"/>
         </w:numPr>
         <w:ind w:left="720" w:hanging="360"/>
         <w:jc w:val="both"/>
@@ -772,7 +2496,7 @@
       <w:pPr>
         <w:numPr>
           <w:ilvl w:val="0"/>
-          <w:numId w:val="3"/>
+          <w:numId w:val="7"/>
         </w:numPr>
         <w:ind w:left="720" w:hanging="360"/>
         <w:jc w:val="both"/>
@@ -791,7 +2515,7 @@
       <w:pPr>
         <w:numPr>
           <w:ilvl w:val="0"/>
-          <w:numId w:val="3"/>
+          <w:numId w:val="7"/>
         </w:numPr>
         <w:ind w:left="720" w:hanging="360"/>
         <w:jc w:val="both"/>
@@ -810,7 +2534,7 @@
       <w:pPr>
         <w:numPr>
           <w:ilvl w:val="0"/>
-          <w:numId w:val="3"/>
+          <w:numId w:val="7"/>
         </w:numPr>
         <w:ind w:left="720" w:hanging="360"/>
         <w:jc w:val="both"/>
@@ -829,7 +2553,7 @@
       <w:pPr>
         <w:numPr>
           <w:ilvl w:val="0"/>
-          <w:numId w:val="3"/>
+          <w:numId w:val="7"/>
         </w:numPr>
         <w:ind w:left="720" w:hanging="360"/>
         <w:jc w:val="both"/>
@@ -848,7 +2572,7 @@
       <w:pPr>
         <w:numPr>
           <w:ilvl w:val="0"/>
-          <w:numId w:val="3"/>
+          <w:numId w:val="7"/>
         </w:numPr>
         <w:ind w:left="720" w:hanging="360"/>
         <w:jc w:val="both"/>
@@ -867,7 +2591,7 @@
       <w:pPr>
         <w:numPr>
           <w:ilvl w:val="0"/>
-          <w:numId w:val="3"/>
+          <w:numId w:val="7"/>
         </w:numPr>
         <w:ind w:left="720" w:hanging="360"/>
         <w:jc w:val="both"/>
@@ -886,7 +2610,7 @@
       <w:pPr>
         <w:numPr>
           <w:ilvl w:val="0"/>
-          <w:numId w:val="3"/>
+          <w:numId w:val="7"/>
         </w:numPr>
         <w:ind w:left="720" w:hanging="360"/>
         <w:jc w:val="both"/>
@@ -905,7 +2629,7 @@
       <w:pPr>
         <w:numPr>
           <w:ilvl w:val="0"/>
-          <w:numId w:val="3"/>
+          <w:numId w:val="7"/>
         </w:numPr>
         <w:ind w:left="720" w:hanging="360"/>
         <w:jc w:val="both"/>
@@ -924,7 +2648,7 @@
       <w:pPr>
         <w:numPr>
           <w:ilvl w:val="0"/>
-          <w:numId w:val="3"/>
+          <w:numId w:val="7"/>
         </w:numPr>
         <w:ind w:left="720" w:hanging="360"/>
         <w:jc w:val="both"/>
@@ -943,7 +2667,7 @@
       <w:pPr>
         <w:numPr>
           <w:ilvl w:val="0"/>
-          <w:numId w:val="3"/>
+          <w:numId w:val="7"/>
         </w:numPr>
         <w:ind w:left="720" w:hanging="360"/>
         <w:jc w:val="both"/>
@@ -962,7 +2686,7 @@
       <w:pPr>
         <w:numPr>
           <w:ilvl w:val="0"/>
-          <w:numId w:val="3"/>
+          <w:numId w:val="7"/>
         </w:numPr>
         <w:ind w:left="720" w:hanging="360"/>
         <w:jc w:val="both"/>
@@ -981,7 +2705,7 @@
       <w:pPr>
         <w:numPr>
           <w:ilvl w:val="0"/>
-          <w:numId w:val="3"/>
+          <w:numId w:val="7"/>
         </w:numPr>
         <w:ind w:left="720" w:hanging="360"/>
         <w:jc w:val="both"/>
@@ -1000,7 +2724,7 @@
       <w:pPr>
         <w:numPr>
           <w:ilvl w:val="0"/>
-          <w:numId w:val="3"/>
+          <w:numId w:val="7"/>
         </w:numPr>
         <w:ind w:left="720" w:hanging="360"/>
         <w:jc w:val="both"/>
@@ -1019,7 +2743,7 @@
       <w:pPr>
         <w:numPr>
           <w:ilvl w:val="0"/>
-          <w:numId w:val="3"/>
+          <w:numId w:val="7"/>
         </w:numPr>
         <w:ind w:left="720" w:hanging="360"/>
         <w:jc w:val="both"/>
@@ -1038,7 +2762,7 @@
       <w:pPr>
         <w:numPr>
           <w:ilvl w:val="0"/>
-          <w:numId w:val="3"/>
+          <w:numId w:val="7"/>
         </w:numPr>
         <w:ind w:left="720" w:hanging="360"/>
         <w:jc w:val="both"/>
@@ -1057,7 +2781,7 @@
       <w:pPr>
         <w:numPr>
           <w:ilvl w:val="0"/>
-          <w:numId w:val="3"/>
+          <w:numId w:val="7"/>
         </w:numPr>
         <w:ind w:left="720" w:hanging="360"/>
         <w:jc w:val="both"/>
@@ -1076,7 +2800,7 @@
       <w:pPr>
         <w:numPr>
           <w:ilvl w:val="0"/>
-          <w:numId w:val="3"/>
+          <w:numId w:val="7"/>
         </w:numPr>
         <w:ind w:left="720" w:hanging="360"/>
         <w:jc w:val="both"/>
@@ -1095,7 +2819,7 @@
       <w:pPr>
         <w:numPr>
           <w:ilvl w:val="0"/>
-          <w:numId w:val="3"/>
+          <w:numId w:val="7"/>
         </w:numPr>
         <w:ind w:left="720" w:hanging="360"/>
         <w:jc w:val="both"/>
@@ -1114,7 +2838,7 @@
       <w:pPr>
         <w:numPr>
           <w:ilvl w:val="0"/>
-          <w:numId w:val="3"/>
+          <w:numId w:val="7"/>
         </w:numPr>
         <w:ind w:left="720" w:hanging="360"/>
         <w:jc w:val="both"/>
@@ -1133,7 +2857,7 @@
       <w:pPr>
         <w:numPr>
           <w:ilvl w:val="0"/>
-          <w:numId w:val="3"/>
+          <w:numId w:val="7"/>
         </w:numPr>
         <w:ind w:left="720" w:hanging="360"/>
         <w:jc w:val="both"/>
@@ -1287,103 +3011,103 @@
       <w:lvlText w:val="●"/>
       <w:lvlJc w:val="left"/>
       <w:pPr>
+        <w:ind w:left="720" w:hanging="360"/>
+      </w:pPr>
+      <w:rPr>
+        <w:u w:val="none"/>
+      </w:rPr>
+    </w:lvl>
+    <w:lvl w:ilvl="1">
+      <w:start w:val="1"/>
+      <w:numFmt w:val="bullet"/>
+      <w:lvlText w:val="○"/>
+      <w:lvlJc w:val="left"/>
+      <w:pPr>
         <w:ind w:left="1440" w:hanging="360"/>
       </w:pPr>
       <w:rPr>
         <w:u w:val="none"/>
       </w:rPr>
     </w:lvl>
-    <w:lvl w:ilvl="1">
+    <w:lvl w:ilvl="2">
+      <w:start w:val="1"/>
+      <w:numFmt w:val="bullet"/>
+      <w:lvlText w:val="■"/>
+      <w:lvlJc w:val="left"/>
+      <w:pPr>
+        <w:ind w:left="2160" w:hanging="360"/>
+      </w:pPr>
+      <w:rPr>
+        <w:u w:val="none"/>
+      </w:rPr>
+    </w:lvl>
+    <w:lvl w:ilvl="3">
+      <w:start w:val="1"/>
+      <w:numFmt w:val="bullet"/>
+      <w:lvlText w:val="●"/>
+      <w:lvlJc w:val="left"/>
+      <w:pPr>
+        <w:ind w:left="2880" w:hanging="360"/>
+      </w:pPr>
+      <w:rPr>
+        <w:u w:val="none"/>
+      </w:rPr>
+    </w:lvl>
+    <w:lvl w:ilvl="4">
       <w:start w:val="1"/>
       <w:numFmt w:val="bullet"/>
       <w:lvlText w:val="○"/>
       <w:lvlJc w:val="left"/>
       <w:pPr>
-        <w:ind w:left="2160" w:hanging="360"/>
-      </w:pPr>
-      <w:rPr>
-        <w:u w:val="none"/>
-      </w:rPr>
-    </w:lvl>
-    <w:lvl w:ilvl="2">
+        <w:ind w:left="3600" w:hanging="360"/>
+      </w:pPr>
+      <w:rPr>
+        <w:u w:val="none"/>
+      </w:rPr>
+    </w:lvl>
+    <w:lvl w:ilvl="5">
       <w:start w:val="1"/>
       <w:numFmt w:val="bullet"/>
       <w:lvlText w:val="■"/>
       <w:lvlJc w:val="left"/>
       <w:pPr>
-        <w:ind w:left="2880" w:hanging="360"/>
-      </w:pPr>
-      <w:rPr>
-        <w:u w:val="none"/>
-      </w:rPr>
-    </w:lvl>
-    <w:lvl w:ilvl="3">
+        <w:ind w:left="4320" w:hanging="360"/>
+      </w:pPr>
+      <w:rPr>
+        <w:u w:val="none"/>
+      </w:rPr>
+    </w:lvl>
+    <w:lvl w:ilvl="6">
       <w:start w:val="1"/>
       <w:numFmt w:val="bullet"/>
       <w:lvlText w:val="●"/>
       <w:lvlJc w:val="left"/>
       <w:pPr>
-        <w:ind w:left="3600" w:hanging="360"/>
-      </w:pPr>
-      <w:rPr>
-        <w:u w:val="none"/>
-      </w:rPr>
-    </w:lvl>
-    <w:lvl w:ilvl="4">
+        <w:ind w:left="5040" w:hanging="360"/>
+      </w:pPr>
+      <w:rPr>
+        <w:u w:val="none"/>
+      </w:rPr>
+    </w:lvl>
+    <w:lvl w:ilvl="7">
       <w:start w:val="1"/>
       <w:numFmt w:val="bullet"/>
       <w:lvlText w:val="○"/>
       <w:lvlJc w:val="left"/>
       <w:pPr>
-        <w:ind w:left="4320" w:hanging="360"/>
-      </w:pPr>
-      <w:rPr>
-        <w:u w:val="none"/>
-      </w:rPr>
-    </w:lvl>
-    <w:lvl w:ilvl="5">
+        <w:ind w:left="5760" w:hanging="360"/>
+      </w:pPr>
+      <w:rPr>
+        <w:u w:val="none"/>
+      </w:rPr>
+    </w:lvl>
+    <w:lvl w:ilvl="8">
       <w:start w:val="1"/>
       <w:numFmt w:val="bullet"/>
       <w:lvlText w:val="■"/>
       <w:lvlJc w:val="left"/>
       <w:pPr>
-        <w:ind w:left="5040" w:hanging="360"/>
-      </w:pPr>
-      <w:rPr>
-        <w:u w:val="none"/>
-      </w:rPr>
-    </w:lvl>
-    <w:lvl w:ilvl="6">
-      <w:start w:val="1"/>
-      <w:numFmt w:val="bullet"/>
-      <w:lvlText w:val="●"/>
-      <w:lvlJc w:val="left"/>
-      <w:pPr>
-        <w:ind w:left="5760" w:hanging="360"/>
-      </w:pPr>
-      <w:rPr>
-        <w:u w:val="none"/>
-      </w:rPr>
-    </w:lvl>
-    <w:lvl w:ilvl="7">
-      <w:start w:val="1"/>
-      <w:numFmt w:val="bullet"/>
-      <w:lvlText w:val="○"/>
-      <w:lvlJc w:val="left"/>
-      <w:pPr>
         <w:ind w:left="6480" w:hanging="360"/>
-      </w:pPr>
-      <w:rPr>
-        <w:u w:val="none"/>
-      </w:rPr>
-    </w:lvl>
-    <w:lvl w:ilvl="8">
-      <w:start w:val="1"/>
-      <w:numFmt w:val="bullet"/>
-      <w:lvlText w:val="■"/>
-      <w:lvlJc w:val="left"/>
-      <w:pPr>
-        <w:ind w:left="7200" w:hanging="360"/>
       </w:pPr>
       <w:rPr>
         <w:u w:val="none"/>
@@ -1507,103 +3231,103 @@
       <w:lvlText w:val="●"/>
       <w:lvlJc w:val="left"/>
       <w:pPr>
+        <w:ind w:left="720" w:hanging="360"/>
+      </w:pPr>
+      <w:rPr>
+        <w:u w:val="none"/>
+      </w:rPr>
+    </w:lvl>
+    <w:lvl w:ilvl="1">
+      <w:start w:val="1"/>
+      <w:numFmt w:val="bullet"/>
+      <w:lvlText w:val="○"/>
+      <w:lvlJc w:val="left"/>
+      <w:pPr>
         <w:ind w:left="1440" w:hanging="360"/>
       </w:pPr>
       <w:rPr>
         <w:u w:val="none"/>
       </w:rPr>
     </w:lvl>
-    <w:lvl w:ilvl="1">
+    <w:lvl w:ilvl="2">
+      <w:start w:val="1"/>
+      <w:numFmt w:val="bullet"/>
+      <w:lvlText w:val="■"/>
+      <w:lvlJc w:val="left"/>
+      <w:pPr>
+        <w:ind w:left="2160" w:hanging="360"/>
+      </w:pPr>
+      <w:rPr>
+        <w:u w:val="none"/>
+      </w:rPr>
+    </w:lvl>
+    <w:lvl w:ilvl="3">
+      <w:start w:val="1"/>
+      <w:numFmt w:val="bullet"/>
+      <w:lvlText w:val="●"/>
+      <w:lvlJc w:val="left"/>
+      <w:pPr>
+        <w:ind w:left="2880" w:hanging="360"/>
+      </w:pPr>
+      <w:rPr>
+        <w:u w:val="none"/>
+      </w:rPr>
+    </w:lvl>
+    <w:lvl w:ilvl="4">
       <w:start w:val="1"/>
       <w:numFmt w:val="bullet"/>
       <w:lvlText w:val="○"/>
       <w:lvlJc w:val="left"/>
       <w:pPr>
-        <w:ind w:left="2160" w:hanging="360"/>
-      </w:pPr>
-      <w:rPr>
-        <w:u w:val="none"/>
-      </w:rPr>
-    </w:lvl>
-    <w:lvl w:ilvl="2">
+        <w:ind w:left="3600" w:hanging="360"/>
+      </w:pPr>
+      <w:rPr>
+        <w:u w:val="none"/>
+      </w:rPr>
+    </w:lvl>
+    <w:lvl w:ilvl="5">
       <w:start w:val="1"/>
       <w:numFmt w:val="bullet"/>
       <w:lvlText w:val="■"/>
       <w:lvlJc w:val="left"/>
       <w:pPr>
-        <w:ind w:left="2880" w:hanging="360"/>
-      </w:pPr>
-      <w:rPr>
-        <w:u w:val="none"/>
-      </w:rPr>
-    </w:lvl>
-    <w:lvl w:ilvl="3">
+        <w:ind w:left="4320" w:hanging="360"/>
+      </w:pPr>
+      <w:rPr>
+        <w:u w:val="none"/>
+      </w:rPr>
+    </w:lvl>
+    <w:lvl w:ilvl="6">
       <w:start w:val="1"/>
       <w:numFmt w:val="bullet"/>
       <w:lvlText w:val="●"/>
       <w:lvlJc w:val="left"/>
       <w:pPr>
-        <w:ind w:left="3600" w:hanging="360"/>
-      </w:pPr>
-      <w:rPr>
-        <w:u w:val="none"/>
-      </w:rPr>
-    </w:lvl>
-    <w:lvl w:ilvl="4">
+        <w:ind w:left="5040" w:hanging="360"/>
+      </w:pPr>
+      <w:rPr>
+        <w:u w:val="none"/>
+      </w:rPr>
+    </w:lvl>
+    <w:lvl w:ilvl="7">
       <w:start w:val="1"/>
       <w:numFmt w:val="bullet"/>
       <w:lvlText w:val="○"/>
       <w:lvlJc w:val="left"/>
       <w:pPr>
-        <w:ind w:left="4320" w:hanging="360"/>
-      </w:pPr>
-      <w:rPr>
-        <w:u w:val="none"/>
-      </w:rPr>
-    </w:lvl>
-    <w:lvl w:ilvl="5">
+        <w:ind w:left="5760" w:hanging="360"/>
+      </w:pPr>
+      <w:rPr>
+        <w:u w:val="none"/>
+      </w:rPr>
+    </w:lvl>
+    <w:lvl w:ilvl="8">
       <w:start w:val="1"/>
       <w:numFmt w:val="bullet"/>
       <w:lvlText w:val="■"/>
       <w:lvlJc w:val="left"/>
       <w:pPr>
-        <w:ind w:left="5040" w:hanging="360"/>
-      </w:pPr>
-      <w:rPr>
-        <w:u w:val="none"/>
-      </w:rPr>
-    </w:lvl>
-    <w:lvl w:ilvl="6">
-      <w:start w:val="1"/>
-      <w:numFmt w:val="bullet"/>
-      <w:lvlText w:val="●"/>
-      <w:lvlJc w:val="left"/>
-      <w:pPr>
-        <w:ind w:left="5760" w:hanging="360"/>
-      </w:pPr>
-      <w:rPr>
-        <w:u w:val="none"/>
-      </w:rPr>
-    </w:lvl>
-    <w:lvl w:ilvl="7">
-      <w:start w:val="1"/>
-      <w:numFmt w:val="bullet"/>
-      <w:lvlText w:val="○"/>
-      <w:lvlJc w:val="left"/>
-      <w:pPr>
         <w:ind w:left="6480" w:hanging="360"/>
-      </w:pPr>
-      <w:rPr>
-        <w:u w:val="none"/>
-      </w:rPr>
-    </w:lvl>
-    <w:lvl w:ilvl="8">
-      <w:start w:val="1"/>
-      <w:numFmt w:val="bullet"/>
-      <w:lvlText w:val="■"/>
-      <w:lvlJc w:val="left"/>
-      <w:pPr>
-        <w:ind w:left="7200" w:hanging="360"/>
       </w:pPr>
       <w:rPr>
         <w:u w:val="none"/>
@@ -1613,6 +3337,556 @@
   <w:abstractNum w:abstractNumId="5">
     <w:lvl w:ilvl="0">
       <w:start w:val="1"/>
+      <w:numFmt w:val="bullet"/>
+      <w:lvlText w:val="●"/>
+      <w:lvlJc w:val="left"/>
+      <w:pPr>
+        <w:ind w:left="1440" w:hanging="360"/>
+      </w:pPr>
+      <w:rPr>
+        <w:u w:val="none"/>
+      </w:rPr>
+    </w:lvl>
+    <w:lvl w:ilvl="1">
+      <w:start w:val="1"/>
+      <w:numFmt w:val="bullet"/>
+      <w:lvlText w:val="○"/>
+      <w:lvlJc w:val="left"/>
+      <w:pPr>
+        <w:ind w:left="2160" w:hanging="360"/>
+      </w:pPr>
+      <w:rPr>
+        <w:u w:val="none"/>
+      </w:rPr>
+    </w:lvl>
+    <w:lvl w:ilvl="2">
+      <w:start w:val="1"/>
+      <w:numFmt w:val="bullet"/>
+      <w:lvlText w:val="■"/>
+      <w:lvlJc w:val="left"/>
+      <w:pPr>
+        <w:ind w:left="2880" w:hanging="360"/>
+      </w:pPr>
+      <w:rPr>
+        <w:u w:val="none"/>
+      </w:rPr>
+    </w:lvl>
+    <w:lvl w:ilvl="3">
+      <w:start w:val="1"/>
+      <w:numFmt w:val="bullet"/>
+      <w:lvlText w:val="●"/>
+      <w:lvlJc w:val="left"/>
+      <w:pPr>
+        <w:ind w:left="3600" w:hanging="360"/>
+      </w:pPr>
+      <w:rPr>
+        <w:u w:val="none"/>
+      </w:rPr>
+    </w:lvl>
+    <w:lvl w:ilvl="4">
+      <w:start w:val="1"/>
+      <w:numFmt w:val="bullet"/>
+      <w:lvlText w:val="○"/>
+      <w:lvlJc w:val="left"/>
+      <w:pPr>
+        <w:ind w:left="4320" w:hanging="360"/>
+      </w:pPr>
+      <w:rPr>
+        <w:u w:val="none"/>
+      </w:rPr>
+    </w:lvl>
+    <w:lvl w:ilvl="5">
+      <w:start w:val="1"/>
+      <w:numFmt w:val="bullet"/>
+      <w:lvlText w:val="■"/>
+      <w:lvlJc w:val="left"/>
+      <w:pPr>
+        <w:ind w:left="5040" w:hanging="360"/>
+      </w:pPr>
+      <w:rPr>
+        <w:u w:val="none"/>
+      </w:rPr>
+    </w:lvl>
+    <w:lvl w:ilvl="6">
+      <w:start w:val="1"/>
+      <w:numFmt w:val="bullet"/>
+      <w:lvlText w:val="●"/>
+      <w:lvlJc w:val="left"/>
+      <w:pPr>
+        <w:ind w:left="5760" w:hanging="360"/>
+      </w:pPr>
+      <w:rPr>
+        <w:u w:val="none"/>
+      </w:rPr>
+    </w:lvl>
+    <w:lvl w:ilvl="7">
+      <w:start w:val="1"/>
+      <w:numFmt w:val="bullet"/>
+      <w:lvlText w:val="○"/>
+      <w:lvlJc w:val="left"/>
+      <w:pPr>
+        <w:ind w:left="6480" w:hanging="360"/>
+      </w:pPr>
+      <w:rPr>
+        <w:u w:val="none"/>
+      </w:rPr>
+    </w:lvl>
+    <w:lvl w:ilvl="8">
+      <w:start w:val="1"/>
+      <w:numFmt w:val="bullet"/>
+      <w:lvlText w:val="■"/>
+      <w:lvlJc w:val="left"/>
+      <w:pPr>
+        <w:ind w:left="7200" w:hanging="360"/>
+      </w:pPr>
+      <w:rPr>
+        <w:u w:val="none"/>
+      </w:rPr>
+    </w:lvl>
+  </w:abstractNum>
+  <w:abstractNum w:abstractNumId="6">
+    <w:lvl w:ilvl="0">
+      <w:start w:val="1"/>
+      <w:numFmt w:val="bullet"/>
+      <w:lvlText w:val="●"/>
+      <w:lvlJc w:val="left"/>
+      <w:pPr>
+        <w:ind w:left="720" w:hanging="360"/>
+      </w:pPr>
+      <w:rPr>
+        <w:u w:val="none"/>
+      </w:rPr>
+    </w:lvl>
+    <w:lvl w:ilvl="1">
+      <w:start w:val="1"/>
+      <w:numFmt w:val="bullet"/>
+      <w:lvlText w:val="○"/>
+      <w:lvlJc w:val="left"/>
+      <w:pPr>
+        <w:ind w:left="1440" w:hanging="360"/>
+      </w:pPr>
+      <w:rPr>
+        <w:u w:val="none"/>
+      </w:rPr>
+    </w:lvl>
+    <w:lvl w:ilvl="2">
+      <w:start w:val="1"/>
+      <w:numFmt w:val="bullet"/>
+      <w:lvlText w:val="■"/>
+      <w:lvlJc w:val="left"/>
+      <w:pPr>
+        <w:ind w:left="2160" w:hanging="360"/>
+      </w:pPr>
+      <w:rPr>
+        <w:u w:val="none"/>
+      </w:rPr>
+    </w:lvl>
+    <w:lvl w:ilvl="3">
+      <w:start w:val="1"/>
+      <w:numFmt w:val="bullet"/>
+      <w:lvlText w:val="●"/>
+      <w:lvlJc w:val="left"/>
+      <w:pPr>
+        <w:ind w:left="2880" w:hanging="360"/>
+      </w:pPr>
+      <w:rPr>
+        <w:u w:val="none"/>
+      </w:rPr>
+    </w:lvl>
+    <w:lvl w:ilvl="4">
+      <w:start w:val="1"/>
+      <w:numFmt w:val="bullet"/>
+      <w:lvlText w:val="○"/>
+      <w:lvlJc w:val="left"/>
+      <w:pPr>
+        <w:ind w:left="3600" w:hanging="360"/>
+      </w:pPr>
+      <w:rPr>
+        <w:u w:val="none"/>
+      </w:rPr>
+    </w:lvl>
+    <w:lvl w:ilvl="5">
+      <w:start w:val="1"/>
+      <w:numFmt w:val="bullet"/>
+      <w:lvlText w:val="■"/>
+      <w:lvlJc w:val="left"/>
+      <w:pPr>
+        <w:ind w:left="4320" w:hanging="360"/>
+      </w:pPr>
+      <w:rPr>
+        <w:u w:val="none"/>
+      </w:rPr>
+    </w:lvl>
+    <w:lvl w:ilvl="6">
+      <w:start w:val="1"/>
+      <w:numFmt w:val="bullet"/>
+      <w:lvlText w:val="●"/>
+      <w:lvlJc w:val="left"/>
+      <w:pPr>
+        <w:ind w:left="5040" w:hanging="360"/>
+      </w:pPr>
+      <w:rPr>
+        <w:u w:val="none"/>
+      </w:rPr>
+    </w:lvl>
+    <w:lvl w:ilvl="7">
+      <w:start w:val="1"/>
+      <w:numFmt w:val="bullet"/>
+      <w:lvlText w:val="○"/>
+      <w:lvlJc w:val="left"/>
+      <w:pPr>
+        <w:ind w:left="5760" w:hanging="360"/>
+      </w:pPr>
+      <w:rPr>
+        <w:u w:val="none"/>
+      </w:rPr>
+    </w:lvl>
+    <w:lvl w:ilvl="8">
+      <w:start w:val="1"/>
+      <w:numFmt w:val="bullet"/>
+      <w:lvlText w:val="■"/>
+      <w:lvlJc w:val="left"/>
+      <w:pPr>
+        <w:ind w:left="6480" w:hanging="360"/>
+      </w:pPr>
+      <w:rPr>
+        <w:u w:val="none"/>
+      </w:rPr>
+    </w:lvl>
+  </w:abstractNum>
+  <w:abstractNum w:abstractNumId="7">
+    <w:lvl w:ilvl="0">
+      <w:start w:val="1"/>
+      <w:numFmt w:val="bullet"/>
+      <w:lvlText w:val="●"/>
+      <w:lvlJc w:val="left"/>
+      <w:pPr>
+        <w:ind w:left="720" w:hanging="360"/>
+      </w:pPr>
+      <w:rPr>
+        <w:u w:val="none"/>
+      </w:rPr>
+    </w:lvl>
+    <w:lvl w:ilvl="1">
+      <w:start w:val="1"/>
+      <w:numFmt w:val="bullet"/>
+      <w:lvlText w:val="○"/>
+      <w:lvlJc w:val="left"/>
+      <w:pPr>
+        <w:ind w:left="1440" w:hanging="360"/>
+      </w:pPr>
+      <w:rPr>
+        <w:u w:val="none"/>
+      </w:rPr>
+    </w:lvl>
+    <w:lvl w:ilvl="2">
+      <w:start w:val="1"/>
+      <w:numFmt w:val="bullet"/>
+      <w:lvlText w:val="■"/>
+      <w:lvlJc w:val="left"/>
+      <w:pPr>
+        <w:ind w:left="2160" w:hanging="360"/>
+      </w:pPr>
+      <w:rPr>
+        <w:u w:val="none"/>
+      </w:rPr>
+    </w:lvl>
+    <w:lvl w:ilvl="3">
+      <w:start w:val="1"/>
+      <w:numFmt w:val="bullet"/>
+      <w:lvlText w:val="●"/>
+      <w:lvlJc w:val="left"/>
+      <w:pPr>
+        <w:ind w:left="2880" w:hanging="360"/>
+      </w:pPr>
+      <w:rPr>
+        <w:u w:val="none"/>
+      </w:rPr>
+    </w:lvl>
+    <w:lvl w:ilvl="4">
+      <w:start w:val="1"/>
+      <w:numFmt w:val="bullet"/>
+      <w:lvlText w:val="○"/>
+      <w:lvlJc w:val="left"/>
+      <w:pPr>
+        <w:ind w:left="3600" w:hanging="360"/>
+      </w:pPr>
+      <w:rPr>
+        <w:u w:val="none"/>
+      </w:rPr>
+    </w:lvl>
+    <w:lvl w:ilvl="5">
+      <w:start w:val="1"/>
+      <w:numFmt w:val="bullet"/>
+      <w:lvlText w:val="■"/>
+      <w:lvlJc w:val="left"/>
+      <w:pPr>
+        <w:ind w:left="4320" w:hanging="360"/>
+      </w:pPr>
+      <w:rPr>
+        <w:u w:val="none"/>
+      </w:rPr>
+    </w:lvl>
+    <w:lvl w:ilvl="6">
+      <w:start w:val="1"/>
+      <w:numFmt w:val="bullet"/>
+      <w:lvlText w:val="●"/>
+      <w:lvlJc w:val="left"/>
+      <w:pPr>
+        <w:ind w:left="5040" w:hanging="360"/>
+      </w:pPr>
+      <w:rPr>
+        <w:u w:val="none"/>
+      </w:rPr>
+    </w:lvl>
+    <w:lvl w:ilvl="7">
+      <w:start w:val="1"/>
+      <w:numFmt w:val="bullet"/>
+      <w:lvlText w:val="○"/>
+      <w:lvlJc w:val="left"/>
+      <w:pPr>
+        <w:ind w:left="5760" w:hanging="360"/>
+      </w:pPr>
+      <w:rPr>
+        <w:u w:val="none"/>
+      </w:rPr>
+    </w:lvl>
+    <w:lvl w:ilvl="8">
+      <w:start w:val="1"/>
+      <w:numFmt w:val="bullet"/>
+      <w:lvlText w:val="■"/>
+      <w:lvlJc w:val="left"/>
+      <w:pPr>
+        <w:ind w:left="6480" w:hanging="360"/>
+      </w:pPr>
+      <w:rPr>
+        <w:u w:val="none"/>
+      </w:rPr>
+    </w:lvl>
+  </w:abstractNum>
+  <w:abstractNum w:abstractNumId="8">
+    <w:lvl w:ilvl="0">
+      <w:start w:val="1"/>
+      <w:numFmt w:val="bullet"/>
+      <w:lvlText w:val="●"/>
+      <w:lvlJc w:val="left"/>
+      <w:pPr>
+        <w:ind w:left="1440" w:hanging="360"/>
+      </w:pPr>
+      <w:rPr>
+        <w:u w:val="none"/>
+      </w:rPr>
+    </w:lvl>
+    <w:lvl w:ilvl="1">
+      <w:start w:val="1"/>
+      <w:numFmt w:val="bullet"/>
+      <w:lvlText w:val="○"/>
+      <w:lvlJc w:val="left"/>
+      <w:pPr>
+        <w:ind w:left="2160" w:hanging="360"/>
+      </w:pPr>
+      <w:rPr>
+        <w:u w:val="none"/>
+      </w:rPr>
+    </w:lvl>
+    <w:lvl w:ilvl="2">
+      <w:start w:val="1"/>
+      <w:numFmt w:val="bullet"/>
+      <w:lvlText w:val="■"/>
+      <w:lvlJc w:val="left"/>
+      <w:pPr>
+        <w:ind w:left="2880" w:hanging="360"/>
+      </w:pPr>
+      <w:rPr>
+        <w:u w:val="none"/>
+      </w:rPr>
+    </w:lvl>
+    <w:lvl w:ilvl="3">
+      <w:start w:val="1"/>
+      <w:numFmt w:val="bullet"/>
+      <w:lvlText w:val="●"/>
+      <w:lvlJc w:val="left"/>
+      <w:pPr>
+        <w:ind w:left="3600" w:hanging="360"/>
+      </w:pPr>
+      <w:rPr>
+        <w:u w:val="none"/>
+      </w:rPr>
+    </w:lvl>
+    <w:lvl w:ilvl="4">
+      <w:start w:val="1"/>
+      <w:numFmt w:val="bullet"/>
+      <w:lvlText w:val="○"/>
+      <w:lvlJc w:val="left"/>
+      <w:pPr>
+        <w:ind w:left="4320" w:hanging="360"/>
+      </w:pPr>
+      <w:rPr>
+        <w:u w:val="none"/>
+      </w:rPr>
+    </w:lvl>
+    <w:lvl w:ilvl="5">
+      <w:start w:val="1"/>
+      <w:numFmt w:val="bullet"/>
+      <w:lvlText w:val="■"/>
+      <w:lvlJc w:val="left"/>
+      <w:pPr>
+        <w:ind w:left="5040" w:hanging="360"/>
+      </w:pPr>
+      <w:rPr>
+        <w:u w:val="none"/>
+      </w:rPr>
+    </w:lvl>
+    <w:lvl w:ilvl="6">
+      <w:start w:val="1"/>
+      <w:numFmt w:val="bullet"/>
+      <w:lvlText w:val="●"/>
+      <w:lvlJc w:val="left"/>
+      <w:pPr>
+        <w:ind w:left="5760" w:hanging="360"/>
+      </w:pPr>
+      <w:rPr>
+        <w:u w:val="none"/>
+      </w:rPr>
+    </w:lvl>
+    <w:lvl w:ilvl="7">
+      <w:start w:val="1"/>
+      <w:numFmt w:val="bullet"/>
+      <w:lvlText w:val="○"/>
+      <w:lvlJc w:val="left"/>
+      <w:pPr>
+        <w:ind w:left="6480" w:hanging="360"/>
+      </w:pPr>
+      <w:rPr>
+        <w:u w:val="none"/>
+      </w:rPr>
+    </w:lvl>
+    <w:lvl w:ilvl="8">
+      <w:start w:val="1"/>
+      <w:numFmt w:val="bullet"/>
+      <w:lvlText w:val="■"/>
+      <w:lvlJc w:val="left"/>
+      <w:pPr>
+        <w:ind w:left="7200" w:hanging="360"/>
+      </w:pPr>
+      <w:rPr>
+        <w:u w:val="none"/>
+      </w:rPr>
+    </w:lvl>
+  </w:abstractNum>
+  <w:abstractNum w:abstractNumId="9">
+    <w:lvl w:ilvl="0">
+      <w:start w:val="1"/>
+      <w:numFmt w:val="bullet"/>
+      <w:lvlText w:val="●"/>
+      <w:lvlJc w:val="left"/>
+      <w:pPr>
+        <w:ind w:left="720" w:hanging="360"/>
+      </w:pPr>
+      <w:rPr>
+        <w:u w:val="none"/>
+      </w:rPr>
+    </w:lvl>
+    <w:lvl w:ilvl="1">
+      <w:start w:val="1"/>
+      <w:numFmt w:val="bullet"/>
+      <w:lvlText w:val="○"/>
+      <w:lvlJc w:val="left"/>
+      <w:pPr>
+        <w:ind w:left="1440" w:hanging="360"/>
+      </w:pPr>
+      <w:rPr>
+        <w:u w:val="none"/>
+      </w:rPr>
+    </w:lvl>
+    <w:lvl w:ilvl="2">
+      <w:start w:val="1"/>
+      <w:numFmt w:val="bullet"/>
+      <w:lvlText w:val="■"/>
+      <w:lvlJc w:val="left"/>
+      <w:pPr>
+        <w:ind w:left="2160" w:hanging="360"/>
+      </w:pPr>
+      <w:rPr>
+        <w:u w:val="none"/>
+      </w:rPr>
+    </w:lvl>
+    <w:lvl w:ilvl="3">
+      <w:start w:val="1"/>
+      <w:numFmt w:val="bullet"/>
+      <w:lvlText w:val="●"/>
+      <w:lvlJc w:val="left"/>
+      <w:pPr>
+        <w:ind w:left="2880" w:hanging="360"/>
+      </w:pPr>
+      <w:rPr>
+        <w:u w:val="none"/>
+      </w:rPr>
+    </w:lvl>
+    <w:lvl w:ilvl="4">
+      <w:start w:val="1"/>
+      <w:numFmt w:val="bullet"/>
+      <w:lvlText w:val="○"/>
+      <w:lvlJc w:val="left"/>
+      <w:pPr>
+        <w:ind w:left="3600" w:hanging="360"/>
+      </w:pPr>
+      <w:rPr>
+        <w:u w:val="none"/>
+      </w:rPr>
+    </w:lvl>
+    <w:lvl w:ilvl="5">
+      <w:start w:val="1"/>
+      <w:numFmt w:val="bullet"/>
+      <w:lvlText w:val="■"/>
+      <w:lvlJc w:val="left"/>
+      <w:pPr>
+        <w:ind w:left="4320" w:hanging="360"/>
+      </w:pPr>
+      <w:rPr>
+        <w:u w:val="none"/>
+      </w:rPr>
+    </w:lvl>
+    <w:lvl w:ilvl="6">
+      <w:start w:val="1"/>
+      <w:numFmt w:val="bullet"/>
+      <w:lvlText w:val="●"/>
+      <w:lvlJc w:val="left"/>
+      <w:pPr>
+        <w:ind w:left="5040" w:hanging="360"/>
+      </w:pPr>
+      <w:rPr>
+        <w:u w:val="none"/>
+      </w:rPr>
+    </w:lvl>
+    <w:lvl w:ilvl="7">
+      <w:start w:val="1"/>
+      <w:numFmt w:val="bullet"/>
+      <w:lvlText w:val="○"/>
+      <w:lvlJc w:val="left"/>
+      <w:pPr>
+        <w:ind w:left="5760" w:hanging="360"/>
+      </w:pPr>
+      <w:rPr>
+        <w:u w:val="none"/>
+      </w:rPr>
+    </w:lvl>
+    <w:lvl w:ilvl="8">
+      <w:start w:val="1"/>
+      <w:numFmt w:val="bullet"/>
+      <w:lvlText w:val="■"/>
+      <w:lvlJc w:val="left"/>
+      <w:pPr>
+        <w:ind w:left="6480" w:hanging="360"/>
+      </w:pPr>
+      <w:rPr>
+        <w:u w:val="none"/>
+      </w:rPr>
+    </w:lvl>
+  </w:abstractNum>
+  <w:abstractNum w:abstractNumId="10">
+    <w:lvl w:ilvl="0">
+      <w:start w:val="1"/>
       <w:numFmt w:val="decimal"/>
       <w:lvlText w:val="%1."/>
       <w:lvlJc w:val="left"/>
@@ -1712,6 +3986,226 @@
       <w:numFmt w:val="lowerRoman"/>
       <w:lvlText w:val="%9."/>
       <w:lvlJc w:val="right"/>
+      <w:pPr>
+        <w:ind w:left="6480" w:hanging="360"/>
+      </w:pPr>
+      <w:rPr>
+        <w:u w:val="none"/>
+      </w:rPr>
+    </w:lvl>
+  </w:abstractNum>
+  <w:abstractNum w:abstractNumId="11">
+    <w:lvl w:ilvl="0">
+      <w:start w:val="1"/>
+      <w:numFmt w:val="bullet"/>
+      <w:lvlText w:val="●"/>
+      <w:lvlJc w:val="left"/>
+      <w:pPr>
+        <w:ind w:left="720" w:hanging="360"/>
+      </w:pPr>
+      <w:rPr>
+        <w:u w:val="none"/>
+      </w:rPr>
+    </w:lvl>
+    <w:lvl w:ilvl="1">
+      <w:start w:val="1"/>
+      <w:numFmt w:val="bullet"/>
+      <w:lvlText w:val="○"/>
+      <w:lvlJc w:val="left"/>
+      <w:pPr>
+        <w:ind w:left="1440" w:hanging="360"/>
+      </w:pPr>
+      <w:rPr>
+        <w:u w:val="none"/>
+      </w:rPr>
+    </w:lvl>
+    <w:lvl w:ilvl="2">
+      <w:start w:val="1"/>
+      <w:numFmt w:val="bullet"/>
+      <w:lvlText w:val="■"/>
+      <w:lvlJc w:val="left"/>
+      <w:pPr>
+        <w:ind w:left="2160" w:hanging="360"/>
+      </w:pPr>
+      <w:rPr>
+        <w:u w:val="none"/>
+      </w:rPr>
+    </w:lvl>
+    <w:lvl w:ilvl="3">
+      <w:start w:val="1"/>
+      <w:numFmt w:val="bullet"/>
+      <w:lvlText w:val="●"/>
+      <w:lvlJc w:val="left"/>
+      <w:pPr>
+        <w:ind w:left="2880" w:hanging="360"/>
+      </w:pPr>
+      <w:rPr>
+        <w:u w:val="none"/>
+      </w:rPr>
+    </w:lvl>
+    <w:lvl w:ilvl="4">
+      <w:start w:val="1"/>
+      <w:numFmt w:val="bullet"/>
+      <w:lvlText w:val="○"/>
+      <w:lvlJc w:val="left"/>
+      <w:pPr>
+        <w:ind w:left="3600" w:hanging="360"/>
+      </w:pPr>
+      <w:rPr>
+        <w:u w:val="none"/>
+      </w:rPr>
+    </w:lvl>
+    <w:lvl w:ilvl="5">
+      <w:start w:val="1"/>
+      <w:numFmt w:val="bullet"/>
+      <w:lvlText w:val="■"/>
+      <w:lvlJc w:val="left"/>
+      <w:pPr>
+        <w:ind w:left="4320" w:hanging="360"/>
+      </w:pPr>
+      <w:rPr>
+        <w:u w:val="none"/>
+      </w:rPr>
+    </w:lvl>
+    <w:lvl w:ilvl="6">
+      <w:start w:val="1"/>
+      <w:numFmt w:val="bullet"/>
+      <w:lvlText w:val="●"/>
+      <w:lvlJc w:val="left"/>
+      <w:pPr>
+        <w:ind w:left="5040" w:hanging="360"/>
+      </w:pPr>
+      <w:rPr>
+        <w:u w:val="none"/>
+      </w:rPr>
+    </w:lvl>
+    <w:lvl w:ilvl="7">
+      <w:start w:val="1"/>
+      <w:numFmt w:val="bullet"/>
+      <w:lvlText w:val="○"/>
+      <w:lvlJc w:val="left"/>
+      <w:pPr>
+        <w:ind w:left="5760" w:hanging="360"/>
+      </w:pPr>
+      <w:rPr>
+        <w:u w:val="none"/>
+      </w:rPr>
+    </w:lvl>
+    <w:lvl w:ilvl="8">
+      <w:start w:val="1"/>
+      <w:numFmt w:val="bullet"/>
+      <w:lvlText w:val="■"/>
+      <w:lvlJc w:val="left"/>
+      <w:pPr>
+        <w:ind w:left="6480" w:hanging="360"/>
+      </w:pPr>
+      <w:rPr>
+        <w:u w:val="none"/>
+      </w:rPr>
+    </w:lvl>
+  </w:abstractNum>
+  <w:abstractNum w:abstractNumId="12">
+    <w:lvl w:ilvl="0">
+      <w:start w:val="1"/>
+      <w:numFmt w:val="decimal"/>
+      <w:lvlText w:val="%1."/>
+      <w:lvlJc w:val="left"/>
+      <w:pPr>
+        <w:ind w:left="720" w:hanging="360"/>
+      </w:pPr>
+      <w:rPr>
+        <w:u w:val="none"/>
+      </w:rPr>
+    </w:lvl>
+    <w:lvl w:ilvl="1">
+      <w:start w:val="1"/>
+      <w:numFmt w:val="lowerLetter"/>
+      <w:lvlText w:val="%2."/>
+      <w:lvlJc w:val="left"/>
+      <w:pPr>
+        <w:ind w:left="1440" w:hanging="360"/>
+      </w:pPr>
+      <w:rPr>
+        <w:u w:val="none"/>
+      </w:rPr>
+    </w:lvl>
+    <w:lvl w:ilvl="2">
+      <w:start w:val="1"/>
+      <w:numFmt w:val="lowerRoman"/>
+      <w:lvlText w:val="%3."/>
+      <w:lvlJc w:val="left"/>
+      <w:pPr>
+        <w:ind w:left="2160" w:hanging="360"/>
+      </w:pPr>
+      <w:rPr>
+        <w:u w:val="none"/>
+      </w:rPr>
+    </w:lvl>
+    <w:lvl w:ilvl="3">
+      <w:start w:val="1"/>
+      <w:numFmt w:val="decimal"/>
+      <w:lvlText w:val="%4."/>
+      <w:lvlJc w:val="left"/>
+      <w:pPr>
+        <w:ind w:left="2880" w:hanging="360"/>
+      </w:pPr>
+      <w:rPr>
+        <w:u w:val="none"/>
+      </w:rPr>
+    </w:lvl>
+    <w:lvl w:ilvl="4">
+      <w:start w:val="1"/>
+      <w:numFmt w:val="lowerLetter"/>
+      <w:lvlText w:val="%5."/>
+      <w:lvlJc w:val="left"/>
+      <w:pPr>
+        <w:ind w:left="3600" w:hanging="360"/>
+      </w:pPr>
+      <w:rPr>
+        <w:u w:val="none"/>
+      </w:rPr>
+    </w:lvl>
+    <w:lvl w:ilvl="5">
+      <w:start w:val="1"/>
+      <w:numFmt w:val="lowerRoman"/>
+      <w:lvlText w:val="%6."/>
+      <w:lvlJc w:val="left"/>
+      <w:pPr>
+        <w:ind w:left="4320" w:hanging="360"/>
+      </w:pPr>
+      <w:rPr>
+        <w:u w:val="none"/>
+      </w:rPr>
+    </w:lvl>
+    <w:lvl w:ilvl="6">
+      <w:start w:val="1"/>
+      <w:numFmt w:val="decimal"/>
+      <w:lvlText w:val="%7."/>
+      <w:lvlJc w:val="left"/>
+      <w:pPr>
+        <w:ind w:left="5040" w:hanging="360"/>
+      </w:pPr>
+      <w:rPr>
+        <w:u w:val="none"/>
+      </w:rPr>
+    </w:lvl>
+    <w:lvl w:ilvl="7">
+      <w:start w:val="1"/>
+      <w:numFmt w:val="lowerLetter"/>
+      <w:lvlText w:val="%8."/>
+      <w:lvlJc w:val="left"/>
+      <w:pPr>
+        <w:ind w:left="5760" w:hanging="360"/>
+      </w:pPr>
+      <w:rPr>
+        <w:u w:val="none"/>
+      </w:rPr>
+    </w:lvl>
+    <w:lvl w:ilvl="8">
+      <w:start w:val="1"/>
+      <w:numFmt w:val="lowerRoman"/>
+      <w:lvlText w:val="%9."/>
+      <w:lvlJc w:val="left"/>
       <w:pPr>
         <w:ind w:left="6480" w:hanging="360"/>
       </w:pPr>
@@ -1734,6 +4228,27 @@
   </w:num>
   <w:num w:numId="5">
     <w:abstractNumId w:val="5"/>
+  </w:num>
+  <w:num w:numId="6">
+    <w:abstractNumId w:val="6"/>
+  </w:num>
+  <w:num w:numId="7">
+    <w:abstractNumId w:val="7"/>
+  </w:num>
+  <w:num w:numId="8">
+    <w:abstractNumId w:val="8"/>
+  </w:num>
+  <w:num w:numId="9">
+    <w:abstractNumId w:val="9"/>
+  </w:num>
+  <w:num w:numId="10">
+    <w:abstractNumId w:val="10"/>
+  </w:num>
+  <w:num w:numId="11">
+    <w:abstractNumId w:val="11"/>
+  </w:num>
+  <w:num w:numId="12">
+    <w:abstractNumId w:val="12"/>
   </w:num>
 </w:numbering>
 </file>

</xml_diff>